<commit_message>
avance del 18 ago 2026
se cea app en Streamlit y se comienza documentación de la solución
</commit_message>
<xml_diff>
--- a/documentacion/TESIS_AGO2026_Rev26_(ZUJ)_06ago2026.docx
+++ b/documentacion/TESIS_AGO2026_Rev26_(ZUJ)_06ago2026.docx
@@ -10481,13 +10481,18 @@
     </w:p>
     <w:p>
       <w:r>
-        <w:t xml:space="preserve">Las microempresas enfrentan desafíos significativos en la planeación financiera y en la gestión de la cadena de suministro, derivados de la alta variabilidad de la demanda, la limitada disponibilidad de herramientas analíticas y la predominancia de decisiones basadas en la intuición del empresario. Esta problemática se intensifica en escenarios de crecimiento, donde la ausencia de modelos analíticos estructurados incrementa la incertidumbre financiera y el riesgo operativo. En este contexto, la Inteligencia de Negocios (Business </w:t>
+        <w:t>Las microempresas enfrentan desafíos significativos en la planeación financiera y en la gestión de la cadena de suministro, derivados de la alta variabilidad de la demanda, la limitada disponibilidad de herramientas analíticas y la predominancia de decisiones basadas en la intuición del empresario. Esta problemática se intensifica en escenarios de crecimiento, donde la ausencia de modelos analíticos estructurados incrementa la incertidumbre financiera y el riesgo operativo. En este contexto, la Inteligencia de Negocios (</w:t>
+      </w:r>
+      <w:proofErr w:type="gramStart"/>
+      <w:r>
+        <w:t xml:space="preserve">Business </w:t>
       </w:r>
       <w:proofErr w:type="spellStart"/>
       <w:r>
         <w:t>Intelligence</w:t>
       </w:r>
       <w:proofErr w:type="spellEnd"/>
+      <w:proofErr w:type="gramEnd"/>
       <w:r>
         <w:t xml:space="preserve">, BI) y el Aprendizaje Automático (Machine </w:t>
       </w:r>
@@ -10510,7 +10515,15 @@
       </w:r>
       <w:proofErr w:type="spellEnd"/>
       <w:r>
-        <w:t>, empresa ubicada en Tizayuca, Hidalgo, mediante la integración y depuración de datos históricos de ingresos, ventas e compras de materia prima, así como de variables temporales y exógenas relacionadas con estacionalidad, fechas especiales y dinámicas comerciales. A partir de este conjunto de datos se diseñarán, entrenarán y compararán modelos supervisados de regresión, ensambles y redes neuronales, evaluados con métricas como MAE, RMSE y MAPE y contrastados tanto con líneas base estadísticas como con el método empírico actualmente utilizado por la empresa. Se espera determinar si la mejora en la precisión del pronóstico contribuye a reducir la incertidumbre en la planeación financiera y a sustentar con mayor evidencia las decisiones de compra, inventario y expansión comercial. El trabajo busca aportar un referente metodológico aplicable a microempresas que enfrentan restricciones de datos, recursos analíticos y alta variabilidad de la demanda.</w:t>
+        <w:t xml:space="preserve">, empresa ubicada en Tizayuca, Hidalgo, mediante la integración y depuración de datos históricos de ingresos, ventas </w:t>
+      </w:r>
+      <w:proofErr w:type="gramStart"/>
+      <w:r>
+        <w:t>e</w:t>
+      </w:r>
+      <w:proofErr w:type="gramEnd"/>
+      <w:r>
+        <w:t xml:space="preserve"> compras de materia prima, así como de variables temporales y exógenas relacionadas con estacionalidad, fechas especiales y dinámicas comerciales. A partir de este conjunto de datos se diseñarán, entrenarán y compararán modelos supervisados de regresión, ensambles y redes neuronales, evaluados con métricas como MAE, RMSE y MAPE y contrastados tanto con líneas base estadísticas como con el método empírico actualmente utilizado por la empresa. Se espera determinar si la mejora en la precisión del pronóstico contribuye a reducir la incertidumbre en la planeación financiera y a sustentar con mayor evidencia las decisiones de compra, inventario y expansión comercial. El trabajo busca aportar un referente metodológico aplicable a microempresas que enfrentan restricciones de datos, recursos analíticos y alta variabilidad de la demanda.</w:t>
       </w:r>
     </w:p>
     <w:p>
@@ -10595,7 +10608,21 @@
         <w:rPr>
           <w:highlight w:val="yellow"/>
         </w:rPr>
-        <w:t xml:space="preserve"> explican que el proceso emprendedor es dinámico y se basa en el aprendizaje continuo derivado de la interacción con el entorno y la toma de decisiones bajo incertidumbre.</w:t>
+        <w:t xml:space="preserve"> explican que el proceso emprendedor es dinámico y se basa en el aprendizaje </w:t>
+      </w:r>
+      <w:proofErr w:type="gramStart"/>
+      <w:r>
+        <w:rPr>
+          <w:highlight w:val="yellow"/>
+        </w:rPr>
+        <w:t>continuo</w:t>
+      </w:r>
+      <w:proofErr w:type="gramEnd"/>
+      <w:r>
+        <w:rPr>
+          <w:highlight w:val="yellow"/>
+        </w:rPr>
+        <w:t xml:space="preserve"> derivado de la interacción con el entorno y la toma de decisiones bajo incertidumbre.</w:t>
       </w:r>
       <w:r>
         <w:t xml:space="preserve"> Asimismo, </w:t>
@@ -10623,8 +10650,18 @@
           <w:iCs/>
           <w:highlight w:val="yellow"/>
         </w:rPr>
-        <w:t>lean startup</w:t>
-      </w:r>
+        <w:t xml:space="preserve">lean </w:t>
+      </w:r>
+      <w:proofErr w:type="gramStart"/>
+      <w:r>
+        <w:rPr>
+          <w:i/>
+          <w:iCs/>
+          <w:highlight w:val="yellow"/>
+        </w:rPr>
+        <w:t>startup</w:t>
+      </w:r>
+      <w:proofErr w:type="gramEnd"/>
       <w:r>
         <w:rPr>
           <w:highlight w:val="yellow"/>
@@ -12240,9 +12277,11 @@
             <w:pPr>
               <w:pStyle w:val="TablaTesis"/>
             </w:pPr>
+            <w:proofErr w:type="gramStart"/>
             <w:r>
               <w:t>EE.UU.</w:t>
             </w:r>
+            <w:proofErr w:type="gramEnd"/>
           </w:p>
         </w:tc>
         <w:tc>
@@ -13419,9 +13458,11 @@
             <w:pPr>
               <w:pStyle w:val="TablaTesis"/>
             </w:pPr>
+            <w:proofErr w:type="gramStart"/>
             <w:r>
               <w:t>EE.UU.</w:t>
             </w:r>
+            <w:proofErr w:type="gramEnd"/>
           </w:p>
         </w:tc>
         <w:tc>
@@ -14340,7 +14381,15 @@
             </w:r>
             <w:proofErr w:type="spellEnd"/>
             <w:r>
-              <w:t xml:space="preserve"> continuo automatizado</w:t>
+              <w:t xml:space="preserve"> </w:t>
+            </w:r>
+            <w:proofErr w:type="gramStart"/>
+            <w:r>
+              <w:t>continuo</w:t>
+            </w:r>
+            <w:proofErr w:type="gramEnd"/>
+            <w:r>
+              <w:t xml:space="preserve"> automatizado</w:t>
             </w:r>
           </w:p>
         </w:tc>
@@ -14808,6 +14857,7 @@
             <w:pPr>
               <w:pStyle w:val="TablaTesis"/>
             </w:pPr>
+            <w:proofErr w:type="gramStart"/>
             <w:r>
               <w:t xml:space="preserve">Business </w:t>
             </w:r>
@@ -14816,6 +14866,7 @@
               <w:t>Intelligence</w:t>
             </w:r>
             <w:proofErr w:type="spellEnd"/>
+            <w:proofErr w:type="gramEnd"/>
             <w:r>
               <w:t xml:space="preserve">, </w:t>
             </w:r>
@@ -15350,6 +15401,7 @@
             <w:pPr>
               <w:pStyle w:val="TablaTesis"/>
             </w:pPr>
+            <w:proofErr w:type="gramStart"/>
             <w:r>
               <w:t xml:space="preserve">Business </w:t>
             </w:r>
@@ -15358,6 +15410,7 @@
               <w:t>Intelligence</w:t>
             </w:r>
             <w:proofErr w:type="spellEnd"/>
+            <w:proofErr w:type="gramEnd"/>
           </w:p>
         </w:tc>
         <w:tc>
@@ -16062,7 +16115,14 @@
         <w:rPr>
           <w:highlight w:val="blue"/>
         </w:rPr>
-        <w:t>en Tizayuca, Hidalgo</w:t>
+        <w:t xml:space="preserve">en Tizayuca, </w:t>
+      </w:r>
+      <w:proofErr w:type="gramStart"/>
+      <w:r>
+        <w:rPr>
+          <w:highlight w:val="blue"/>
+        </w:rPr>
+        <w:t>Hidalgo</w:t>
       </w:r>
       <w:r>
         <w:t xml:space="preserve">, </w:t>
@@ -16073,6 +16133,7 @@
         </w:rPr>
         <w:t>frente al método empírico utilizado históricamente?</w:t>
       </w:r>
+      <w:proofErr w:type="gramEnd"/>
     </w:p>
     <w:p>
       <w:pPr>
@@ -17353,7 +17414,15 @@
     <w:p>
       <w:r>
         <w:lastRenderedPageBreak/>
-        <w:t xml:space="preserve">El emprendedor acumula experiencia a través de un proceso dinámico de aprendizaje continuo derivado de la interacción directa con su mercado </w:t>
+        <w:t xml:space="preserve">El emprendedor acumula experiencia a través de un proceso dinámico de aprendizaje </w:t>
+      </w:r>
+      <w:proofErr w:type="gramStart"/>
+      <w:r>
+        <w:t>continuo</w:t>
+      </w:r>
+      <w:proofErr w:type="gramEnd"/>
+      <w:r>
+        <w:t xml:space="preserve"> derivado de la interacción directa con su mercado </w:t>
       </w:r>
       <w:r>
         <w:rPr>
@@ -18044,6 +18113,7 @@
       <w:r>
         <w:t>La evolución del pensamiento administrativo y tecnológico ha consolidado a la Inteligencia de Negocios (</w:t>
       </w:r>
+      <w:proofErr w:type="gramStart"/>
       <w:r>
         <w:rPr>
           <w:i/>
@@ -18060,6 +18130,7 @@
         <w:t>Intelligence</w:t>
       </w:r>
       <w:proofErr w:type="spellEnd"/>
+      <w:proofErr w:type="gramEnd"/>
       <w:r>
         <w:t xml:space="preserve">, BI) no como una mera herramienta de visualización de datos, sino como un marco arquitectónico, metodológico y conceptual de transformación corporativa. Para rastrear los fundamentos de BI, es indispensable acudir a la evolución de los Sistemas de Soporte a la Decisión (DSS, por sus siglas en inglés), cuya conceptualización formal fue estructurada por </w:t>
       </w:r>
@@ -18827,11 +18898,19 @@
         </w:pBdr>
         <w:spacing w:before="0"/>
       </w:pPr>
+      <w:proofErr w:type="gramStart"/>
       <w:r>
         <w:rPr>
           <w:color w:val="000000"/>
         </w:rPr>
-        <w:t>Prever con antelación matemática los periodos de contracción de la demanda estacional (los "valles" de venta), permitiendo construir reservas de liquidez precautorias.</w:t>
+        <w:t>Prever con antelación</w:t>
+      </w:r>
+      <w:proofErr w:type="gramEnd"/>
+      <w:r>
+        <w:rPr>
+          <w:color w:val="000000"/>
+        </w:rPr>
+        <w:t xml:space="preserve"> matemática los periodos de contracción de la demanda estacional (los "valles" de venta), permitiendo construir reservas de liquidez precautorias.</w:t>
       </w:r>
     </w:p>
     <w:p>
@@ -19531,12 +19610,21 @@
       <w:r>
         <w:t xml:space="preserve">Un modelo </w:t>
       </w:r>
+      <w:proofErr w:type="gramStart"/>
       <w:r>
         <w:rPr>
           <w:i/>
           <w:iCs/>
         </w:rPr>
-        <w:t>ARIMA(p, d, q)</w:t>
+        <w:t>ARIMA(</w:t>
+      </w:r>
+      <w:proofErr w:type="gramEnd"/>
+      <w:r>
+        <w:rPr>
+          <w:i/>
+          <w:iCs/>
+        </w:rPr>
+        <w:t>p, d, q)</w:t>
       </w:r>
       <w:r>
         <w:t xml:space="preserve"> descompone la dinámica de una serie temporal en tres componentes matemáticos esenciales:</w:t>
@@ -19926,7 +20014,31 @@
           <w:i/>
           <w:iCs/>
         </w:rPr>
-        <w:t>SARIMA (p, d, q)(P, D, Q)</w:t>
+        <w:t xml:space="preserve">SARIMA (p, d, </w:t>
+      </w:r>
+      <w:proofErr w:type="gramStart"/>
+      <w:r>
+        <w:rPr>
+          <w:i/>
+          <w:iCs/>
+        </w:rPr>
+        <w:t>q)(</w:t>
+      </w:r>
+      <w:proofErr w:type="gramEnd"/>
+      <w:r>
+        <w:rPr>
+          <w:i/>
+          <w:iCs/>
+        </w:rPr>
+        <w:t xml:space="preserve">P, D, </w:t>
+      </w:r>
+      <w:proofErr w:type="gramStart"/>
+      <w:r>
+        <w:rPr>
+          <w:i/>
+          <w:iCs/>
+        </w:rPr>
+        <w:t>Q)</w:t>
       </w:r>
       <w:r>
         <w:rPr>
@@ -19937,7 +20049,11 @@
         <w:t>s</w:t>
       </w:r>
       <w:r>
-        <w:t xml:space="preserve">. En esta formulación, los operadores estacionales de orden superior </w:t>
+        <w:t>.</w:t>
+      </w:r>
+      <w:proofErr w:type="gramEnd"/>
+      <w:r>
+        <w:t xml:space="preserve"> En esta formulación, los operadores estacionales de orden superior </w:t>
       </w:r>
       <w:r>
         <w:rPr>
@@ -21378,7 +21494,15 @@
       </w:r>
       <w:proofErr w:type="spellEnd"/>
       <w:r>
-        <w:t xml:space="preserve"> y S. Usha (2023) identifican que en la industria de la panificación y la repostería, la ventana de comercialización óptima suele medirse en horas o, en el mejor de los casos, en un par de días. Una vez superado este umbral temporal, el valor de recuperación del inventario (</w:t>
+        <w:t xml:space="preserve"> y S. Usha (2023) identifican </w:t>
+      </w:r>
+      <w:proofErr w:type="gramStart"/>
+      <w:r>
+        <w:t>que</w:t>
+      </w:r>
+      <w:proofErr w:type="gramEnd"/>
+      <w:r>
+        <w:t xml:space="preserve"> en la industria de la panificación y la repostería, la ventana de comercialización óptima suele medirse en horas o, en el mejor de los casos, en un par de días. Una vez superado este umbral temporal, el valor de recuperación del inventario (</w:t>
       </w:r>
       <w:proofErr w:type="spellStart"/>
       <w:r>
@@ -21729,19 +21853,23 @@
         <w:t xml:space="preserve">Matemáticamente, la función de pérdida asimétrica se expresa mediante la </w:t>
       </w:r>
       <w:r>
+        <w:t>Ecuación del Costo Estimado</w:t>
+      </w:r>
+      <w:r>
+        <w:t xml:space="preserve"> (</w:t>
+      </w:r>
+      <w:r>
         <w:fldChar w:fldCharType="begin"/>
       </w:r>
       <w:r>
-        <w:instrText xml:space="preserve"> REF _Ref235629012 \h </w:instrText>
+        <w:instrText xml:space="preserve"> REF Ec_CostoEstimado \h </w:instrText>
       </w:r>
       <w:r>
         <w:fldChar w:fldCharType="separate"/>
       </w:r>
       <w:r>
-        <w:t xml:space="preserve">Ecuación </w:t>
-      </w:r>
-      <w:r>
-        <w:rPr>
+        <w:rPr>
+          <w:i/>
           <w:noProof/>
         </w:rPr>
         <w:t>1</w:t>
@@ -21750,265 +21878,395 @@
         <w:fldChar w:fldCharType="end"/>
       </w:r>
       <w:r>
+        <w:fldChar w:fldCharType="begin"/>
+      </w:r>
+      <w:r>
+        <w:instrText xml:space="preserve"> REF Ec_CostoEstimado \h </w:instrText>
+      </w:r>
+      <w:r>
+        <w:fldChar w:fldCharType="separate"/>
+      </w:r>
+      <w:r>
+        <w:fldChar w:fldCharType="end"/>
+      </w:r>
+      <w:r>
+        <w:fldChar w:fldCharType="begin"/>
+      </w:r>
+      <w:r>
+        <w:instrText xml:space="preserve"> REF Ec_CostoEstimado \h </w:instrText>
+      </w:r>
+      <w:r>
+        <w:fldChar w:fldCharType="end"/>
+      </w:r>
+      <w:r>
+        <w:fldChar w:fldCharType="begin"/>
+      </w:r>
+      <w:r>
+        <w:instrText xml:space="preserve"> REF Ec_CostoEstimado \h </w:instrText>
+      </w:r>
+      <w:r>
+        <w:fldChar w:fldCharType="end"/>
+      </w:r>
+      <w:r>
+        <w:fldChar w:fldCharType="begin"/>
+      </w:r>
+      <w:r>
+        <w:instrText xml:space="preserve"> REF Ec_CostoEstimado \h </w:instrText>
+      </w:r>
+      <w:r>
+        <w:fldChar w:fldCharType="end"/>
+      </w:r>
+      <w:r>
+        <w:t>)</w:t>
+      </w:r>
+      <w:r>
         <w:t>:</w:t>
       </w:r>
     </w:p>
-    <w:p>
-      <w:pPr>
-        <w:keepNext/>
-        <w:jc w:val="center"/>
-      </w:pPr>
-      <m:oMathPara>
-        <m:oMath>
-          <m:r>
-            <w:rPr>
-              <w:rFonts w:ascii="Cambria Math" w:hAnsi="Cambria Math"/>
-            </w:rPr>
-            <m:t>E</m:t>
-          </m:r>
-          <m:d>
-            <m:dPr>
-              <m:begChr m:val="["/>
-              <m:endChr m:val="]"/>
-              <m:ctrlPr>
-                <w:rPr>
-                  <w:rFonts w:ascii="Cambria Math" w:hAnsi="Cambria Math"/>
-                  <w:i/>
-                </w:rPr>
-              </m:ctrlPr>
-            </m:dPr>
-            <m:e>
-              <m:r>
-                <w:rPr>
-                  <w:rFonts w:ascii="Cambria Math" w:hAnsi="Cambria Math"/>
-                </w:rPr>
-                <m:t>Cost</m:t>
-              </m:r>
-            </m:e>
-          </m:d>
-          <m:r>
-            <w:rPr>
-              <w:rFonts w:ascii="Cambria Math" w:hAnsi="Cambria Math"/>
-            </w:rPr>
-            <m:t>=</m:t>
-          </m:r>
-          <m:sSub>
-            <m:sSubPr>
-              <m:ctrlPr>
-                <w:rPr>
-                  <w:rFonts w:ascii="Cambria Math" w:hAnsi="Cambria Math"/>
-                  <w:i/>
-                </w:rPr>
-              </m:ctrlPr>
-            </m:sSubPr>
-            <m:e>
-              <m:r>
-                <w:rPr>
-                  <w:rFonts w:ascii="Cambria Math" w:hAnsi="Cambria Math"/>
-                </w:rPr>
-                <m:t>c</m:t>
-              </m:r>
-            </m:e>
-            <m:sub>
-              <m:r>
-                <w:rPr>
-                  <w:rFonts w:ascii="Cambria Math" w:hAnsi="Cambria Math"/>
-                </w:rPr>
-                <m:t>u</m:t>
-              </m:r>
-            </m:sub>
-          </m:sSub>
-          <m:r>
-            <w:rPr>
-              <w:rFonts w:ascii="Cambria Math" w:hAnsi="Cambria Math"/>
-            </w:rPr>
-            <m:t>E</m:t>
-          </m:r>
-          <m:d>
-            <m:dPr>
-              <m:begChr m:val="["/>
-              <m:endChr m:val="]"/>
-              <m:ctrlPr>
-                <w:rPr>
-                  <w:rFonts w:ascii="Cambria Math" w:hAnsi="Cambria Math"/>
-                  <w:i/>
-                </w:rPr>
-              </m:ctrlPr>
-            </m:dPr>
-            <m:e>
-              <m:func>
-                <m:funcPr>
-                  <m:ctrlPr>
-                    <w:rPr>
-                      <w:rFonts w:ascii="Cambria Math" w:hAnsi="Cambria Math"/>
-                    </w:rPr>
-                  </m:ctrlPr>
-                </m:funcPr>
-                <m:fName>
-                  <m:r>
-                    <m:rPr>
-                      <m:sty m:val="p"/>
-                    </m:rPr>
-                    <w:rPr>
-                      <w:rFonts w:ascii="Cambria Math" w:hAnsi="Cambria Math"/>
-                    </w:rPr>
-                    <m:t>max</m:t>
-                  </m:r>
-                  <m:ctrlPr>
-                    <w:rPr>
-                      <w:rFonts w:ascii="Cambria Math" w:hAnsi="Cambria Math"/>
-                      <w:i/>
-                    </w:rPr>
-                  </m:ctrlPr>
-                </m:fName>
-                <m:e>
-                  <m:d>
-                    <m:dPr>
-                      <m:ctrlPr>
-                        <w:rPr>
-                          <w:rFonts w:ascii="Cambria Math" w:hAnsi="Cambria Math"/>
-                          <w:i/>
-                        </w:rPr>
-                      </m:ctrlPr>
-                    </m:dPr>
-                    <m:e>
-                      <m:r>
-                        <w:rPr>
-                          <w:rFonts w:ascii="Cambria Math" w:hAnsi="Cambria Math"/>
-                        </w:rPr>
-                        <m:t>D-Q,0</m:t>
-                      </m:r>
-                    </m:e>
-                  </m:d>
-                </m:e>
-              </m:func>
-            </m:e>
-          </m:d>
-          <m:r>
-            <w:rPr>
-              <w:rFonts w:ascii="Cambria Math" w:hAnsi="Cambria Math"/>
-            </w:rPr>
-            <m:t>+</m:t>
-          </m:r>
-          <m:sSub>
-            <m:sSubPr>
-              <m:ctrlPr>
-                <w:rPr>
-                  <w:rFonts w:ascii="Cambria Math" w:hAnsi="Cambria Math"/>
-                  <w:i/>
-                </w:rPr>
-              </m:ctrlPr>
-            </m:sSubPr>
-            <m:e>
-              <m:r>
-                <w:rPr>
-                  <w:rFonts w:ascii="Cambria Math" w:hAnsi="Cambria Math"/>
-                </w:rPr>
-                <m:t>c</m:t>
-              </m:r>
-            </m:e>
-            <m:sub>
-              <m:r>
-                <w:rPr>
-                  <w:rFonts w:ascii="Cambria Math" w:hAnsi="Cambria Math"/>
-                </w:rPr>
-                <m:t>o</m:t>
-              </m:r>
-            </m:sub>
-          </m:sSub>
-          <m:r>
-            <w:rPr>
-              <w:rFonts w:ascii="Cambria Math" w:hAnsi="Cambria Math"/>
-            </w:rPr>
-            <m:t>E</m:t>
-          </m:r>
-          <m:d>
-            <m:dPr>
-              <m:begChr m:val="["/>
-              <m:endChr m:val="]"/>
-              <m:ctrlPr>
-                <w:rPr>
-                  <w:rFonts w:ascii="Cambria Math" w:hAnsi="Cambria Math"/>
-                  <w:i/>
-                </w:rPr>
-              </m:ctrlPr>
-            </m:dPr>
-            <m:e>
-              <m:func>
-                <m:funcPr>
-                  <m:ctrlPr>
-                    <w:rPr>
-                      <w:rFonts w:ascii="Cambria Math" w:hAnsi="Cambria Math"/>
-                    </w:rPr>
-                  </m:ctrlPr>
-                </m:funcPr>
-                <m:fName>
-                  <m:r>
-                    <m:rPr>
-                      <m:sty m:val="p"/>
-                    </m:rPr>
-                    <w:rPr>
-                      <w:rFonts w:ascii="Cambria Math" w:hAnsi="Cambria Math"/>
-                    </w:rPr>
-                    <m:t>max</m:t>
-                  </m:r>
-                  <m:ctrlPr>
-                    <w:rPr>
-                      <w:rFonts w:ascii="Cambria Math" w:hAnsi="Cambria Math"/>
-                      <w:i/>
-                    </w:rPr>
-                  </m:ctrlPr>
-                </m:fName>
-                <m:e>
-                  <m:d>
-                    <m:dPr>
-                      <m:ctrlPr>
-                        <w:rPr>
-                          <w:rFonts w:ascii="Cambria Math" w:hAnsi="Cambria Math"/>
-                          <w:i/>
-                        </w:rPr>
-                      </m:ctrlPr>
-                    </m:dPr>
-                    <m:e>
-                      <m:r>
-                        <w:rPr>
-                          <w:rFonts w:ascii="Cambria Math" w:hAnsi="Cambria Math"/>
-                        </w:rPr>
-                        <m:t>Q-D,0</m:t>
-                      </m:r>
-                    </m:e>
-                  </m:d>
-                </m:e>
-              </m:func>
-            </m:e>
-          </m:d>
-        </m:oMath>
-      </m:oMathPara>
-    </w:p>
-    <w:p>
-      <w:pPr>
-        <w:pStyle w:val="Descripcin"/>
-        <w:jc w:val="center"/>
-      </w:pPr>
-      <w:bookmarkStart w:id="84" w:name="_Ref235629012"/>
-      <w:bookmarkStart w:id="85" w:name="_Toc235867473"/>
-      <w:r>
-        <w:t xml:space="preserve">Ecuación </w:t>
-      </w:r>
-      <w:fldSimple w:instr=" SEQ Ecuación \* ARABIC ">
-        <w:r>
-          <w:rPr>
-            <w:noProof/>
-          </w:rPr>
-          <w:t>1</w:t>
-        </w:r>
-      </w:fldSimple>
-      <w:bookmarkEnd w:id="84"/>
-      <w:r>
-        <w:t>-Ecuación del costo estimado</w:t>
-      </w:r>
-      <w:bookmarkEnd w:id="85"/>
-    </w:p>
+    <w:tbl>
+      <w:tblPr>
+        <w:tblStyle w:val="Tablaconcuadrcula"/>
+        <w:tblW w:w="0" w:type="auto"/>
+        <w:tblBorders>
+          <w:top w:val="none" w:sz="0" w:space="0" w:color="auto"/>
+          <w:left w:val="none" w:sz="0" w:space="0" w:color="auto"/>
+          <w:bottom w:val="none" w:sz="0" w:space="0" w:color="auto"/>
+          <w:right w:val="none" w:sz="0" w:space="0" w:color="auto"/>
+          <w:insideH w:val="none" w:sz="0" w:space="0" w:color="auto"/>
+          <w:insideV w:val="none" w:sz="0" w:space="0" w:color="auto"/>
+        </w:tblBorders>
+        <w:tblLook w:val="04A0" w:firstRow="1" w:lastRow="0" w:firstColumn="1" w:lastColumn="0" w:noHBand="0" w:noVBand="1"/>
+      </w:tblPr>
+      <w:tblGrid>
+        <w:gridCol w:w="1134"/>
+        <w:gridCol w:w="7938"/>
+        <w:gridCol w:w="890"/>
+      </w:tblGrid>
+      <w:tr>
+        <w:tc>
+          <w:tcPr>
+            <w:tcW w:w="1134" w:type="dxa"/>
+          </w:tcPr>
+          <w:p/>
+        </w:tc>
+        <w:tc>
+          <w:tcPr>
+            <w:tcW w:w="7938" w:type="dxa"/>
+          </w:tcPr>
+          <w:p>
+            <m:oMathPara>
+              <m:oMath>
+                <m:r>
+                  <w:rPr>
+                    <w:rFonts w:ascii="Cambria Math" w:hAnsi="Cambria Math"/>
+                  </w:rPr>
+                  <m:t>E</m:t>
+                </m:r>
+                <m:d>
+                  <m:dPr>
+                    <m:begChr m:val="["/>
+                    <m:endChr m:val="]"/>
+                    <m:ctrlPr>
+                      <w:rPr>
+                        <w:rFonts w:ascii="Cambria Math" w:hAnsi="Cambria Math"/>
+                        <w:i/>
+                      </w:rPr>
+                    </m:ctrlPr>
+                  </m:dPr>
+                  <m:e>
+                    <m:r>
+                      <w:rPr>
+                        <w:rFonts w:ascii="Cambria Math" w:hAnsi="Cambria Math"/>
+                      </w:rPr>
+                      <m:t>Cost</m:t>
+                    </m:r>
+                  </m:e>
+                </m:d>
+                <m:r>
+                  <w:rPr>
+                    <w:rFonts w:ascii="Cambria Math" w:hAnsi="Cambria Math"/>
+                  </w:rPr>
+                  <m:t>=</m:t>
+                </m:r>
+                <m:sSub>
+                  <m:sSubPr>
+                    <m:ctrlPr>
+                      <w:rPr>
+                        <w:rFonts w:ascii="Cambria Math" w:hAnsi="Cambria Math"/>
+                        <w:i/>
+                      </w:rPr>
+                    </m:ctrlPr>
+                  </m:sSubPr>
+                  <m:e>
+                    <m:r>
+                      <w:rPr>
+                        <w:rFonts w:ascii="Cambria Math" w:hAnsi="Cambria Math"/>
+                      </w:rPr>
+                      <m:t>c</m:t>
+                    </m:r>
+                  </m:e>
+                  <m:sub>
+                    <m:r>
+                      <w:rPr>
+                        <w:rFonts w:ascii="Cambria Math" w:hAnsi="Cambria Math"/>
+                      </w:rPr>
+                      <m:t>u</m:t>
+                    </m:r>
+                  </m:sub>
+                </m:sSub>
+                <m:r>
+                  <w:rPr>
+                    <w:rFonts w:ascii="Cambria Math" w:hAnsi="Cambria Math"/>
+                  </w:rPr>
+                  <m:t>E</m:t>
+                </m:r>
+                <m:d>
+                  <m:dPr>
+                    <m:begChr m:val="["/>
+                    <m:endChr m:val="]"/>
+                    <m:ctrlPr>
+                      <w:rPr>
+                        <w:rFonts w:ascii="Cambria Math" w:hAnsi="Cambria Math"/>
+                        <w:i/>
+                      </w:rPr>
+                    </m:ctrlPr>
+                  </m:dPr>
+                  <m:e>
+                    <m:func>
+                      <m:funcPr>
+                        <m:ctrlPr>
+                          <w:rPr>
+                            <w:rFonts w:ascii="Cambria Math" w:hAnsi="Cambria Math"/>
+                          </w:rPr>
+                        </m:ctrlPr>
+                      </m:funcPr>
+                      <m:fName>
+                        <m:r>
+                          <m:rPr>
+                            <m:sty m:val="p"/>
+                          </m:rPr>
+                          <w:rPr>
+                            <w:rFonts w:ascii="Cambria Math" w:hAnsi="Cambria Math"/>
+                          </w:rPr>
+                          <m:t>max</m:t>
+                        </m:r>
+                        <m:ctrlPr>
+                          <w:rPr>
+                            <w:rFonts w:ascii="Cambria Math" w:hAnsi="Cambria Math"/>
+                            <w:i/>
+                          </w:rPr>
+                        </m:ctrlPr>
+                      </m:fName>
+                      <m:e>
+                        <m:d>
+                          <m:dPr>
+                            <m:ctrlPr>
+                              <w:rPr>
+                                <w:rFonts w:ascii="Cambria Math" w:hAnsi="Cambria Math"/>
+                                <w:i/>
+                              </w:rPr>
+                            </m:ctrlPr>
+                          </m:dPr>
+                          <m:e>
+                            <m:r>
+                              <w:rPr>
+                                <w:rFonts w:ascii="Cambria Math" w:hAnsi="Cambria Math"/>
+                              </w:rPr>
+                              <m:t>D-Q,0</m:t>
+                            </m:r>
+                          </m:e>
+                        </m:d>
+                      </m:e>
+                    </m:func>
+                  </m:e>
+                </m:d>
+                <m:r>
+                  <w:rPr>
+                    <w:rFonts w:ascii="Cambria Math" w:hAnsi="Cambria Math"/>
+                  </w:rPr>
+                  <m:t>+</m:t>
+                </m:r>
+                <m:sSub>
+                  <m:sSubPr>
+                    <m:ctrlPr>
+                      <w:rPr>
+                        <w:rFonts w:ascii="Cambria Math" w:hAnsi="Cambria Math"/>
+                        <w:i/>
+                      </w:rPr>
+                    </m:ctrlPr>
+                  </m:sSubPr>
+                  <m:e>
+                    <m:r>
+                      <w:rPr>
+                        <w:rFonts w:ascii="Cambria Math" w:hAnsi="Cambria Math"/>
+                      </w:rPr>
+                      <m:t>c</m:t>
+                    </m:r>
+                  </m:e>
+                  <m:sub>
+                    <m:r>
+                      <w:rPr>
+                        <w:rFonts w:ascii="Cambria Math" w:hAnsi="Cambria Math"/>
+                      </w:rPr>
+                      <m:t>o</m:t>
+                    </m:r>
+                  </m:sub>
+                </m:sSub>
+                <m:r>
+                  <w:rPr>
+                    <w:rFonts w:ascii="Cambria Math" w:hAnsi="Cambria Math"/>
+                  </w:rPr>
+                  <m:t>E</m:t>
+                </m:r>
+                <m:d>
+                  <m:dPr>
+                    <m:begChr m:val="["/>
+                    <m:endChr m:val="]"/>
+                    <m:ctrlPr>
+                      <w:rPr>
+                        <w:rFonts w:ascii="Cambria Math" w:hAnsi="Cambria Math"/>
+                        <w:i/>
+                      </w:rPr>
+                    </m:ctrlPr>
+                  </m:dPr>
+                  <m:e>
+                    <m:func>
+                      <m:funcPr>
+                        <m:ctrlPr>
+                          <w:rPr>
+                            <w:rFonts w:ascii="Cambria Math" w:hAnsi="Cambria Math"/>
+                          </w:rPr>
+                        </m:ctrlPr>
+                      </m:funcPr>
+                      <m:fName>
+                        <m:r>
+                          <m:rPr>
+                            <m:sty m:val="p"/>
+                          </m:rPr>
+                          <w:rPr>
+                            <w:rFonts w:ascii="Cambria Math" w:hAnsi="Cambria Math"/>
+                          </w:rPr>
+                          <m:t>max</m:t>
+                        </m:r>
+                        <m:ctrlPr>
+                          <w:rPr>
+                            <w:rFonts w:ascii="Cambria Math" w:hAnsi="Cambria Math"/>
+                            <w:i/>
+                          </w:rPr>
+                        </m:ctrlPr>
+                      </m:fName>
+                      <m:e>
+                        <m:d>
+                          <m:dPr>
+                            <m:ctrlPr>
+                              <w:rPr>
+                                <w:rFonts w:ascii="Cambria Math" w:hAnsi="Cambria Math"/>
+                                <w:i/>
+                              </w:rPr>
+                            </m:ctrlPr>
+                          </m:dPr>
+                          <m:e>
+                            <m:r>
+                              <w:rPr>
+                                <w:rFonts w:ascii="Cambria Math" w:hAnsi="Cambria Math"/>
+                              </w:rPr>
+                              <m:t>Q-D,0</m:t>
+                            </m:r>
+                          </m:e>
+                        </m:d>
+                      </m:e>
+                    </m:func>
+                  </m:e>
+                </m:d>
+              </m:oMath>
+            </m:oMathPara>
+          </w:p>
+        </w:tc>
+        <w:tc>
+          <w:tcPr>
+            <w:tcW w:w="890" w:type="dxa"/>
+          </w:tcPr>
+          <w:p>
+            <w:pPr>
+              <w:pStyle w:val="Descripcin"/>
+              <w:jc w:val="right"/>
+              <w:rPr>
+                <w:i w:val="0"/>
+                <w:sz w:val="24"/>
+                <w:szCs w:val="24"/>
+              </w:rPr>
+            </w:pPr>
+            <w:r>
+              <w:rPr>
+                <w:i w:val="0"/>
+                <w:sz w:val="24"/>
+                <w:szCs w:val="24"/>
+              </w:rPr>
+              <w:t>(</w:t>
+            </w:r>
+            <w:bookmarkStart w:id="84" w:name="Ec_CostoEstimado"/>
+            <w:r>
+              <w:rPr>
+                <w:i w:val="0"/>
+                <w:sz w:val="24"/>
+                <w:szCs w:val="24"/>
+              </w:rPr>
+              <w:fldChar w:fldCharType="begin"/>
+            </w:r>
+            <w:r>
+              <w:rPr>
+                <w:i w:val="0"/>
+                <w:sz w:val="24"/>
+                <w:szCs w:val="24"/>
+              </w:rPr>
+              <w:instrText>SEQ Ecuacion \* ARABIC</w:instrText>
+            </w:r>
+            <w:r>
+              <w:rPr>
+                <w:i w:val="0"/>
+                <w:sz w:val="24"/>
+                <w:szCs w:val="24"/>
+              </w:rPr>
+              <w:instrText xml:space="preserve"> </w:instrText>
+            </w:r>
+            <w:r>
+              <w:rPr>
+                <w:i w:val="0"/>
+                <w:sz w:val="24"/>
+                <w:szCs w:val="24"/>
+              </w:rPr>
+              <w:fldChar w:fldCharType="separate"/>
+            </w:r>
+            <w:r>
+              <w:rPr>
+                <w:i w:val="0"/>
+                <w:noProof/>
+                <w:sz w:val="24"/>
+                <w:szCs w:val="24"/>
+              </w:rPr>
+              <w:t>1</w:t>
+            </w:r>
+            <w:r>
+              <w:rPr>
+                <w:i w:val="0"/>
+                <w:sz w:val="24"/>
+                <w:szCs w:val="24"/>
+              </w:rPr>
+              <w:fldChar w:fldCharType="end"/>
+            </w:r>
+            <w:bookmarkEnd w:id="84"/>
+            <w:r>
+              <w:rPr>
+                <w:i w:val="0"/>
+                <w:sz w:val="24"/>
+                <w:szCs w:val="24"/>
+              </w:rPr>
+              <w:t>)</w:t>
+            </w:r>
+          </w:p>
+        </w:tc>
+      </w:tr>
+    </w:tbl>
     <w:p>
       <w:r>
         <w:t xml:space="preserve">En la gestión empírica e intuitiva (como la que predominó en los primeros diez años de </w:t>
@@ -22096,8 +22354,8 @@
           <w:numId w:val="19"/>
         </w:numPr>
       </w:pPr>
-      <w:bookmarkStart w:id="86" w:name="_Toc233383599"/>
-      <w:bookmarkStart w:id="87" w:name="_Toc235808061"/>
+      <w:bookmarkStart w:id="85" w:name="_Toc233383599"/>
+      <w:bookmarkStart w:id="86" w:name="_Toc235808061"/>
       <w:r>
         <w:t xml:space="preserve">Variabilidad de la Demanda y </w:t>
       </w:r>
@@ -22109,8 +22367,8 @@
       <w:r>
         <w:t xml:space="preserve"> en la Repostería Creativa</w:t>
       </w:r>
+      <w:bookmarkEnd w:id="85"/>
       <w:bookmarkEnd w:id="86"/>
-      <w:bookmarkEnd w:id="87"/>
     </w:p>
     <w:p>
       <w:r>
@@ -22285,13 +22543,13 @@
           <w:numId w:val="19"/>
         </w:numPr>
       </w:pPr>
-      <w:bookmarkStart w:id="88" w:name="_Toc233383600"/>
-      <w:bookmarkStart w:id="89" w:name="_Toc235808062"/>
+      <w:bookmarkStart w:id="87" w:name="_Toc233383600"/>
+      <w:bookmarkStart w:id="88" w:name="_Toc235808062"/>
       <w:r>
         <w:t>Impacto Financiero y Medioambiental de la Integración de Modelos Predictivos</w:t>
       </w:r>
+      <w:bookmarkEnd w:id="87"/>
       <w:bookmarkEnd w:id="88"/>
-      <w:bookmarkEnd w:id="89"/>
     </w:p>
     <w:p>
       <w:r>
@@ -22432,13 +22690,13 @@
           <w:numId w:val="19"/>
         </w:numPr>
       </w:pPr>
-      <w:bookmarkStart w:id="90" w:name="_Toc233383601"/>
-      <w:bookmarkStart w:id="91" w:name="_Toc235808063"/>
+      <w:bookmarkStart w:id="89" w:name="_Toc233383601"/>
+      <w:bookmarkStart w:id="90" w:name="_Toc235808063"/>
       <w:r>
         <w:t>Desafíos de Integración: Del Algoritmo Matemático a la Ejecución Operativa</w:t>
       </w:r>
+      <w:bookmarkEnd w:id="89"/>
       <w:bookmarkEnd w:id="90"/>
-      <w:bookmarkEnd w:id="91"/>
     </w:p>
     <w:p>
       <w:r>
@@ -22483,7 +22741,15 @@
       </w:r>
       <w:proofErr w:type="spellEnd"/>
       <w:r>
-        <w:t xml:space="preserve"> para generar una "explosión de materiales": el sistema no solo predice la demanda del producto final, sino que indica a la administración la cantidad exacta en kilogramos de harina, azúcar, huevos y empaques que deben ser solicitados al proveedor local el día lunes, respetando los plazos de entrega (</w:t>
+        <w:t xml:space="preserve"> para generar una "explosión de materiales": el sistema no solo predice la demanda del producto final, sino que indica a la administración la cantidad exacta en kilogramos de harina, azúcar, huevos y empaques que deben ser solicitados al proveedor local el </w:t>
+      </w:r>
+      <w:proofErr w:type="gramStart"/>
+      <w:r>
+        <w:t>día lunes</w:t>
+      </w:r>
+      <w:proofErr w:type="gramEnd"/>
+      <w:r>
+        <w:t>, respetando los plazos de entrega (</w:t>
       </w:r>
       <w:r>
         <w:rPr>
@@ -22509,13 +22775,13 @@
           <w:numId w:val="19"/>
         </w:numPr>
       </w:pPr>
-      <w:bookmarkStart w:id="92" w:name="_Toc233383602"/>
-      <w:bookmarkStart w:id="93" w:name="_Toc235808064"/>
+      <w:bookmarkStart w:id="91" w:name="_Toc233383602"/>
+      <w:bookmarkStart w:id="92" w:name="_Toc235808064"/>
       <w:r>
         <w:t>Conclusión</w:t>
       </w:r>
+      <w:bookmarkEnd w:id="91"/>
       <w:bookmarkEnd w:id="92"/>
-      <w:bookmarkEnd w:id="93"/>
     </w:p>
     <w:p>
       <w:r>
@@ -22544,8 +22810,8 @@
           <w:numId w:val="19"/>
         </w:numPr>
       </w:pPr>
-      <w:bookmarkStart w:id="94" w:name="_Toc233383603"/>
-      <w:bookmarkStart w:id="95" w:name="_Toc235808065"/>
+      <w:bookmarkStart w:id="93" w:name="_Toc233383603"/>
+      <w:bookmarkStart w:id="94" w:name="_Toc235808065"/>
       <w:r>
         <w:t xml:space="preserve">Fundamentos técnicos del modelado predictivo en entornos de </w:t>
       </w:r>
@@ -22556,8 +22822,8 @@
         </w:rPr>
         <w:t>Small Data</w:t>
       </w:r>
+      <w:bookmarkEnd w:id="93"/>
       <w:bookmarkEnd w:id="94"/>
-      <w:bookmarkEnd w:id="95"/>
     </w:p>
     <w:p>
       <w:r>
@@ -22666,8 +22932,8 @@
           <w:numId w:val="19"/>
         </w:numPr>
       </w:pPr>
-      <w:bookmarkStart w:id="96" w:name="_Toc233383604"/>
-      <w:bookmarkStart w:id="97" w:name="_Toc235808066"/>
+      <w:bookmarkStart w:id="95" w:name="_Toc233383604"/>
+      <w:bookmarkStart w:id="96" w:name="_Toc235808066"/>
       <w:r>
         <w:lastRenderedPageBreak/>
         <w:t xml:space="preserve">La Paradoja de la Dimensionalidad y el Fenómeno del </w:t>
@@ -22682,8 +22948,8 @@
       <w:r>
         <w:t xml:space="preserve"> en la Microempresa</w:t>
       </w:r>
+      <w:bookmarkEnd w:id="95"/>
       <w:bookmarkEnd w:id="96"/>
-      <w:bookmarkEnd w:id="97"/>
     </w:p>
     <w:p>
       <w:r>
@@ -22849,8 +23115,8 @@
           <w:numId w:val="19"/>
         </w:numPr>
       </w:pPr>
-      <w:bookmarkStart w:id="98" w:name="_Toc233383605"/>
-      <w:bookmarkStart w:id="99" w:name="_Toc235808067"/>
+      <w:bookmarkStart w:id="97" w:name="_Toc233383605"/>
+      <w:bookmarkStart w:id="98" w:name="_Toc235808067"/>
       <w:r>
         <w:lastRenderedPageBreak/>
         <w:t>El Equilibrio Sesgo-Varianza (</w:t>
@@ -22902,8 +23168,8 @@
       <w:r>
         <w:t>)</w:t>
       </w:r>
+      <w:bookmarkEnd w:id="97"/>
       <w:bookmarkEnd w:id="98"/>
-      <w:bookmarkEnd w:id="99"/>
     </w:p>
     <w:p>
       <w:r>
@@ -22961,259 +23227,349 @@
         <w:t xml:space="preserve"> </w:t>
       </w:r>
       <w:r>
+        <w:t>Ecuación</w:t>
+      </w:r>
+      <w:r>
+        <w:t xml:space="preserve"> del Precio Esperado (</w:t>
+      </w:r>
+      <w:r>
         <w:fldChar w:fldCharType="begin"/>
       </w:r>
       <w:r>
-        <w:instrText xml:space="preserve"> REF _Ref235633521 \h </w:instrText>
+        <w:instrText xml:space="preserve"> REF Ec_PrediccionEsperado \h </w:instrText>
       </w:r>
       <w:r>
         <w:fldChar w:fldCharType="separate"/>
       </w:r>
       <w:r>
-        <w:t xml:space="preserve">Ecuación </w:t>
-      </w:r>
-      <w:r>
-        <w:rPr>
+        <w:rPr>
+          <w:i/>
           <w:noProof/>
         </w:rPr>
         <w:t>2</w:t>
       </w:r>
       <w:r>
-        <w:t xml:space="preserve"> - Ecuación de Predicción Esperado</w:t>
-      </w:r>
-      <w:r>
         <w:fldChar w:fldCharType="end"/>
       </w:r>
       <w:r>
-        <w:t xml:space="preserve"> (EPE) de cualquier modelo de aprendizaje supervisado aplicado a un conjunto de datos no observados se descompone aditivamente en tres elementos inseparables:</w:t>
-      </w:r>
-    </w:p>
-    <w:p>
-      <w:pPr>
-        <w:keepNext/>
-        <w:jc w:val="center"/>
-      </w:pPr>
-      <m:oMathPara>
-        <m:oMath>
-          <m:r>
-            <w:rPr>
-              <w:rFonts w:ascii="Cambria Math" w:hAnsi="Cambria Math"/>
-            </w:rPr>
-            <m:t>Err</m:t>
-          </m:r>
-          <m:d>
-            <m:dPr>
-              <m:ctrlPr>
-                <w:rPr>
-                  <w:rFonts w:ascii="Cambria Math" w:hAnsi="Cambria Math"/>
-                  <w:i/>
-                </w:rPr>
-              </m:ctrlPr>
-            </m:dPr>
-            <m:e>
-              <m:r>
-                <w:rPr>
-                  <w:rFonts w:ascii="Cambria Math" w:hAnsi="Cambria Math"/>
-                </w:rPr>
-                <m:t>x</m:t>
-              </m:r>
-            </m:e>
-          </m:d>
-          <m:r>
-            <w:rPr>
-              <w:rFonts w:ascii="Cambria Math" w:hAnsi="Cambria Math"/>
-            </w:rPr>
-            <m:t>=</m:t>
-          </m:r>
-          <m:sSup>
-            <m:sSupPr>
-              <m:ctrlPr>
-                <w:rPr>
-                  <w:rFonts w:ascii="Cambria Math" w:hAnsi="Cambria Math"/>
-                  <w:i/>
-                </w:rPr>
-              </m:ctrlPr>
-            </m:sSupPr>
-            <m:e>
-              <m:r>
-                <w:rPr>
-                  <w:rFonts w:ascii="Cambria Math" w:hAnsi="Cambria Math"/>
-                </w:rPr>
-                <m:t>Sesgo</m:t>
-              </m:r>
-            </m:e>
-            <m:sup>
-              <m:r>
-                <w:rPr>
-                  <w:rFonts w:ascii="Cambria Math" w:hAnsi="Cambria Math"/>
-                </w:rPr>
-                <m:t>2</m:t>
-              </m:r>
-            </m:sup>
-          </m:sSup>
-          <m:d>
-            <m:dPr>
-              <m:ctrlPr>
-                <w:rPr>
-                  <w:rFonts w:ascii="Cambria Math" w:hAnsi="Cambria Math"/>
-                  <w:i/>
-                </w:rPr>
-              </m:ctrlPr>
-            </m:dPr>
-            <m:e>
-              <m:acc>
-                <m:accPr>
-                  <m:ctrlPr>
-                    <w:rPr>
-                      <w:rFonts w:ascii="Cambria Math" w:hAnsi="Cambria Math"/>
-                      <w:i/>
-                    </w:rPr>
-                  </m:ctrlPr>
-                </m:accPr>
-                <m:e>
-                  <m:r>
-                    <w:rPr>
-                      <w:rFonts w:ascii="Cambria Math" w:hAnsi="Cambria Math"/>
-                    </w:rPr>
-                    <m:t>f</m:t>
-                  </m:r>
-                </m:e>
-              </m:acc>
-              <m:d>
-                <m:dPr>
-                  <m:ctrlPr>
-                    <w:rPr>
-                      <w:rFonts w:ascii="Cambria Math" w:hAnsi="Cambria Math"/>
-                      <w:i/>
-                    </w:rPr>
-                  </m:ctrlPr>
-                </m:dPr>
-                <m:e>
-                  <m:r>
-                    <w:rPr>
-                      <w:rFonts w:ascii="Cambria Math" w:hAnsi="Cambria Math"/>
-                    </w:rPr>
-                    <m:t>x</m:t>
-                  </m:r>
-                </m:e>
-              </m:d>
-            </m:e>
-          </m:d>
-          <m:r>
-            <w:rPr>
-              <w:rFonts w:ascii="Cambria Math" w:hAnsi="Cambria Math"/>
-            </w:rPr>
-            <m:t>+Varianza</m:t>
-          </m:r>
-          <m:d>
-            <m:dPr>
-              <m:ctrlPr>
-                <w:rPr>
-                  <w:rFonts w:ascii="Cambria Math" w:hAnsi="Cambria Math"/>
-                  <w:i/>
-                </w:rPr>
-              </m:ctrlPr>
-            </m:dPr>
-            <m:e>
-              <m:acc>
-                <m:accPr>
-                  <m:ctrlPr>
-                    <w:rPr>
-                      <w:rFonts w:ascii="Cambria Math" w:hAnsi="Cambria Math"/>
-                      <w:i/>
-                    </w:rPr>
-                  </m:ctrlPr>
-                </m:accPr>
-                <m:e>
-                  <m:r>
-                    <w:rPr>
-                      <w:rFonts w:ascii="Cambria Math" w:hAnsi="Cambria Math"/>
-                    </w:rPr>
-                    <m:t>f</m:t>
-                  </m:r>
-                </m:e>
-              </m:acc>
-              <m:d>
-                <m:dPr>
-                  <m:ctrlPr>
-                    <w:rPr>
-                      <w:rFonts w:ascii="Cambria Math" w:hAnsi="Cambria Math"/>
-                      <w:i/>
-                    </w:rPr>
-                  </m:ctrlPr>
-                </m:dPr>
-                <m:e>
-                  <m:r>
-                    <w:rPr>
-                      <w:rFonts w:ascii="Cambria Math" w:hAnsi="Cambria Math"/>
-                    </w:rPr>
-                    <m:t>x</m:t>
-                  </m:r>
-                </m:e>
-              </m:d>
-            </m:e>
-          </m:d>
-          <m:r>
-            <w:rPr>
-              <w:rFonts w:ascii="Cambria Math" w:hAnsi="Cambria Math"/>
-            </w:rPr>
-            <m:t>+</m:t>
-          </m:r>
-          <m:sSup>
-            <m:sSupPr>
-              <m:ctrlPr>
-                <w:rPr>
-                  <w:rFonts w:ascii="Cambria Math" w:hAnsi="Cambria Math"/>
-                  <w:i/>
-                </w:rPr>
-              </m:ctrlPr>
-            </m:sSupPr>
-            <m:e>
-              <m:r>
-                <w:rPr>
-                  <w:rFonts w:ascii="Cambria Math" w:hAnsi="Cambria Math"/>
-                </w:rPr>
-                <m:t>σ</m:t>
-              </m:r>
-            </m:e>
-            <m:sup>
-              <m:r>
-                <w:rPr>
-                  <w:rFonts w:ascii="Cambria Math" w:hAnsi="Cambria Math"/>
-                </w:rPr>
-                <m:t>2</m:t>
-              </m:r>
-            </m:sup>
-          </m:sSup>
-        </m:oMath>
-      </m:oMathPara>
-    </w:p>
-    <w:p>
-      <w:pPr>
-        <w:pStyle w:val="Descripcin"/>
-        <w:jc w:val="center"/>
-      </w:pPr>
-      <w:bookmarkStart w:id="100" w:name="_Ref235633479"/>
-      <w:bookmarkStart w:id="101" w:name="_Ref235633521"/>
-      <w:bookmarkStart w:id="102" w:name="_Toc235867474"/>
-      <w:r>
-        <w:t xml:space="preserve">Ecuación </w:t>
-      </w:r>
-      <w:fldSimple w:instr=" SEQ Ecuación \* ARABIC ">
-        <w:r>
-          <w:rPr>
-            <w:noProof/>
-          </w:rPr>
-          <w:t>2</w:t>
-        </w:r>
-      </w:fldSimple>
-      <w:bookmarkEnd w:id="100"/>
-      <w:r>
-        <w:t xml:space="preserve"> - Ecuación de Predicción Esperado</w:t>
-      </w:r>
-      <w:bookmarkEnd w:id="101"/>
-      <w:bookmarkEnd w:id="102"/>
-    </w:p>
+        <w:t xml:space="preserve">) </w:t>
+      </w:r>
+      <w:r>
+        <w:t>de cualquier modelo de aprendizaje supervisado aplicado a un conjunto de datos no observados se descompone aditivamente en tres elementos inseparables:</w:t>
+      </w:r>
+    </w:p>
+    <w:tbl>
+      <w:tblPr>
+        <w:tblStyle w:val="Tablaconcuadrcula"/>
+        <w:tblW w:w="0" w:type="auto"/>
+        <w:tblBorders>
+          <w:top w:val="none" w:sz="0" w:space="0" w:color="auto"/>
+          <w:left w:val="none" w:sz="0" w:space="0" w:color="auto"/>
+          <w:bottom w:val="none" w:sz="0" w:space="0" w:color="auto"/>
+          <w:right w:val="none" w:sz="0" w:space="0" w:color="auto"/>
+          <w:insideH w:val="none" w:sz="0" w:space="0" w:color="auto"/>
+          <w:insideV w:val="none" w:sz="0" w:space="0" w:color="auto"/>
+        </w:tblBorders>
+        <w:tblLook w:val="04A0" w:firstRow="1" w:lastRow="0" w:firstColumn="1" w:lastColumn="0" w:noHBand="0" w:noVBand="1"/>
+      </w:tblPr>
+      <w:tblGrid>
+        <w:gridCol w:w="1134"/>
+        <w:gridCol w:w="7938"/>
+        <w:gridCol w:w="890"/>
+      </w:tblGrid>
+      <w:tr>
+        <w:tc>
+          <w:tcPr>
+            <w:tcW w:w="1134" w:type="dxa"/>
+          </w:tcPr>
+          <w:p/>
+        </w:tc>
+        <w:tc>
+          <w:tcPr>
+            <w:tcW w:w="7938" w:type="dxa"/>
+          </w:tcPr>
+          <w:p>
+            <m:oMathPara>
+              <m:oMath>
+                <m:r>
+                  <w:rPr>
+                    <w:rFonts w:ascii="Cambria Math" w:hAnsi="Cambria Math"/>
+                  </w:rPr>
+                  <m:t>Err</m:t>
+                </m:r>
+                <m:d>
+                  <m:dPr>
+                    <m:ctrlPr>
+                      <w:rPr>
+                        <w:rFonts w:ascii="Cambria Math" w:hAnsi="Cambria Math"/>
+                        <w:i/>
+                      </w:rPr>
+                    </m:ctrlPr>
+                  </m:dPr>
+                  <m:e>
+                    <m:r>
+                      <w:rPr>
+                        <w:rFonts w:ascii="Cambria Math" w:hAnsi="Cambria Math"/>
+                      </w:rPr>
+                      <m:t>x</m:t>
+                    </m:r>
+                  </m:e>
+                </m:d>
+                <m:r>
+                  <w:rPr>
+                    <w:rFonts w:ascii="Cambria Math" w:hAnsi="Cambria Math"/>
+                  </w:rPr>
+                  <m:t>=</m:t>
+                </m:r>
+                <m:sSup>
+                  <m:sSupPr>
+                    <m:ctrlPr>
+                      <w:rPr>
+                        <w:rFonts w:ascii="Cambria Math" w:hAnsi="Cambria Math"/>
+                        <w:i/>
+                      </w:rPr>
+                    </m:ctrlPr>
+                  </m:sSupPr>
+                  <m:e>
+                    <m:r>
+                      <w:rPr>
+                        <w:rFonts w:ascii="Cambria Math" w:hAnsi="Cambria Math"/>
+                      </w:rPr>
+                      <m:t>Sesgo</m:t>
+                    </m:r>
+                  </m:e>
+                  <m:sup>
+                    <m:r>
+                      <w:rPr>
+                        <w:rFonts w:ascii="Cambria Math" w:hAnsi="Cambria Math"/>
+                      </w:rPr>
+                      <m:t>2</m:t>
+                    </m:r>
+                  </m:sup>
+                </m:sSup>
+                <m:d>
+                  <m:dPr>
+                    <m:ctrlPr>
+                      <w:rPr>
+                        <w:rFonts w:ascii="Cambria Math" w:hAnsi="Cambria Math"/>
+                        <w:i/>
+                      </w:rPr>
+                    </m:ctrlPr>
+                  </m:dPr>
+                  <m:e>
+                    <m:acc>
+                      <m:accPr>
+                        <m:ctrlPr>
+                          <w:rPr>
+                            <w:rFonts w:ascii="Cambria Math" w:hAnsi="Cambria Math"/>
+                            <w:i/>
+                          </w:rPr>
+                        </m:ctrlPr>
+                      </m:accPr>
+                      <m:e>
+                        <m:r>
+                          <w:rPr>
+                            <w:rFonts w:ascii="Cambria Math" w:hAnsi="Cambria Math"/>
+                          </w:rPr>
+                          <m:t>f</m:t>
+                        </m:r>
+                      </m:e>
+                    </m:acc>
+                    <m:d>
+                      <m:dPr>
+                        <m:ctrlPr>
+                          <w:rPr>
+                            <w:rFonts w:ascii="Cambria Math" w:hAnsi="Cambria Math"/>
+                            <w:i/>
+                          </w:rPr>
+                        </m:ctrlPr>
+                      </m:dPr>
+                      <m:e>
+                        <m:r>
+                          <w:rPr>
+                            <w:rFonts w:ascii="Cambria Math" w:hAnsi="Cambria Math"/>
+                          </w:rPr>
+                          <m:t>x</m:t>
+                        </m:r>
+                      </m:e>
+                    </m:d>
+                  </m:e>
+                </m:d>
+                <m:r>
+                  <w:rPr>
+                    <w:rFonts w:ascii="Cambria Math" w:hAnsi="Cambria Math"/>
+                  </w:rPr>
+                  <m:t>+Varianza</m:t>
+                </m:r>
+                <m:d>
+                  <m:dPr>
+                    <m:ctrlPr>
+                      <w:rPr>
+                        <w:rFonts w:ascii="Cambria Math" w:hAnsi="Cambria Math"/>
+                        <w:i/>
+                      </w:rPr>
+                    </m:ctrlPr>
+                  </m:dPr>
+                  <m:e>
+                    <m:acc>
+                      <m:accPr>
+                        <m:ctrlPr>
+                          <w:rPr>
+                            <w:rFonts w:ascii="Cambria Math" w:hAnsi="Cambria Math"/>
+                            <w:i/>
+                          </w:rPr>
+                        </m:ctrlPr>
+                      </m:accPr>
+                      <m:e>
+                        <m:r>
+                          <w:rPr>
+                            <w:rFonts w:ascii="Cambria Math" w:hAnsi="Cambria Math"/>
+                          </w:rPr>
+                          <m:t>f</m:t>
+                        </m:r>
+                      </m:e>
+                    </m:acc>
+                    <m:d>
+                      <m:dPr>
+                        <m:ctrlPr>
+                          <w:rPr>
+                            <w:rFonts w:ascii="Cambria Math" w:hAnsi="Cambria Math"/>
+                            <w:i/>
+                          </w:rPr>
+                        </m:ctrlPr>
+                      </m:dPr>
+                      <m:e>
+                        <m:r>
+                          <w:rPr>
+                            <w:rFonts w:ascii="Cambria Math" w:hAnsi="Cambria Math"/>
+                          </w:rPr>
+                          <m:t>x</m:t>
+                        </m:r>
+                      </m:e>
+                    </m:d>
+                  </m:e>
+                </m:d>
+                <m:r>
+                  <w:rPr>
+                    <w:rFonts w:ascii="Cambria Math" w:hAnsi="Cambria Math"/>
+                  </w:rPr>
+                  <m:t>+</m:t>
+                </m:r>
+                <m:sSup>
+                  <m:sSupPr>
+                    <m:ctrlPr>
+                      <w:rPr>
+                        <w:rFonts w:ascii="Cambria Math" w:hAnsi="Cambria Math"/>
+                        <w:i/>
+                      </w:rPr>
+                    </m:ctrlPr>
+                  </m:sSupPr>
+                  <m:e>
+                    <m:r>
+                      <w:rPr>
+                        <w:rFonts w:ascii="Cambria Math" w:hAnsi="Cambria Math"/>
+                      </w:rPr>
+                      <m:t>σ</m:t>
+                    </m:r>
+                  </m:e>
+                  <m:sup>
+                    <m:r>
+                      <w:rPr>
+                        <w:rFonts w:ascii="Cambria Math" w:hAnsi="Cambria Math"/>
+                      </w:rPr>
+                      <m:t>2</m:t>
+                    </m:r>
+                  </m:sup>
+                </m:sSup>
+              </m:oMath>
+            </m:oMathPara>
+          </w:p>
+        </w:tc>
+        <w:tc>
+          <w:tcPr>
+            <w:tcW w:w="890" w:type="dxa"/>
+          </w:tcPr>
+          <w:p>
+            <w:pPr>
+              <w:pStyle w:val="Descripcin"/>
+              <w:jc w:val="right"/>
+              <w:rPr>
+                <w:i w:val="0"/>
+                <w:sz w:val="24"/>
+                <w:szCs w:val="24"/>
+              </w:rPr>
+            </w:pPr>
+            <w:r>
+              <w:rPr>
+                <w:i w:val="0"/>
+                <w:sz w:val="24"/>
+                <w:szCs w:val="24"/>
+              </w:rPr>
+              <w:t>(</w:t>
+            </w:r>
+            <w:bookmarkStart w:id="99" w:name="Ec_PrediccionEsperado"/>
+            <w:r>
+              <w:rPr>
+                <w:i w:val="0"/>
+                <w:sz w:val="24"/>
+                <w:szCs w:val="24"/>
+              </w:rPr>
+              <w:fldChar w:fldCharType="begin"/>
+            </w:r>
+            <w:r>
+              <w:rPr>
+                <w:i w:val="0"/>
+                <w:sz w:val="24"/>
+                <w:szCs w:val="24"/>
+              </w:rPr>
+              <w:instrText>SEQ Ecuacion \* ARABIC</w:instrText>
+            </w:r>
+            <w:r>
+              <w:rPr>
+                <w:i w:val="0"/>
+                <w:sz w:val="24"/>
+                <w:szCs w:val="24"/>
+              </w:rPr>
+              <w:instrText xml:space="preserve"> </w:instrText>
+            </w:r>
+            <w:r>
+              <w:rPr>
+                <w:i w:val="0"/>
+                <w:sz w:val="24"/>
+                <w:szCs w:val="24"/>
+              </w:rPr>
+              <w:fldChar w:fldCharType="separate"/>
+            </w:r>
+            <w:r>
+              <w:rPr>
+                <w:i w:val="0"/>
+                <w:noProof/>
+                <w:sz w:val="24"/>
+                <w:szCs w:val="24"/>
+              </w:rPr>
+              <w:t>2</w:t>
+            </w:r>
+            <w:r>
+              <w:rPr>
+                <w:i w:val="0"/>
+                <w:sz w:val="24"/>
+                <w:szCs w:val="24"/>
+              </w:rPr>
+              <w:fldChar w:fldCharType="end"/>
+            </w:r>
+            <w:bookmarkEnd w:id="99"/>
+            <w:r>
+              <w:rPr>
+                <w:i w:val="0"/>
+                <w:sz w:val="24"/>
+                <w:szCs w:val="24"/>
+              </w:rPr>
+              <w:t>)</w:t>
+            </w:r>
+          </w:p>
+        </w:tc>
+      </w:tr>
+    </w:tbl>
     <w:p>
       <w:r>
         <w:t>Donde:</w:t>
@@ -23413,15 +23769,12 @@
         <w:t>)</w:t>
       </w:r>
       <w:r>
-        <w:t xml:space="preserve">. El algoritmo aprende no solo la tendencia genuina del mercado, sino que asimila </w:t>
-      </w:r>
+        <w:t>. El algoritmo aprende no solo la tendencia genuina del mercado, sino que asimila el ruido estadístico, las anomalías temporales y las variaciones fortuitas del pasado como si fueran leyes universales del negocio.</w:t>
+      </w:r>
+    </w:p>
+    <w:p>
       <w:r>
         <w:lastRenderedPageBreak/>
-        <w:t>el ruido estadístico, las anomalías temporales y las variaciones fortuitas del pasado como si fueran leyes universales del negocio.</w:t>
-      </w:r>
-    </w:p>
-    <w:p>
-      <w:r>
         <w:t xml:space="preserve">Si </w:t>
       </w:r>
       <w:proofErr w:type="spellStart"/>
@@ -23449,13 +23802,13 @@
           <w:numId w:val="19"/>
         </w:numPr>
       </w:pPr>
-      <w:bookmarkStart w:id="103" w:name="_Toc233383606"/>
-      <w:bookmarkStart w:id="104" w:name="_Toc235808068"/>
+      <w:bookmarkStart w:id="100" w:name="_Toc233383606"/>
+      <w:bookmarkStart w:id="101" w:name="_Toc235808068"/>
       <w:r>
         <w:t>Estrategias de Regularización y Contracción Matemática para la Parsimonia</w:t>
       </w:r>
-      <w:bookmarkEnd w:id="103"/>
-      <w:bookmarkEnd w:id="104"/>
+      <w:bookmarkEnd w:id="100"/>
+      <w:bookmarkEnd w:id="101"/>
     </w:p>
     <w:p>
       <w:r>
@@ -23612,22 +23965,23 @@
         <w:t xml:space="preserve"> Su función de pérdida incorpora la penalización absoluta de los coeficientes, representada matemáticamente </w:t>
       </w:r>
       <w:r>
-        <w:t xml:space="preserve">en la </w:t>
+        <w:t xml:space="preserve">en </w:t>
+      </w:r>
+      <w:r>
+        <w:t>(</w:t>
       </w:r>
       <w:r>
         <w:fldChar w:fldCharType="begin"/>
       </w:r>
       <w:r>
-        <w:instrText xml:space="preserve"> REF _Ref235633596 \h </w:instrText>
+        <w:instrText xml:space="preserve"> REF Ec_RegressionLasso \h </w:instrText>
       </w:r>
       <w:r>
         <w:fldChar w:fldCharType="separate"/>
       </w:r>
       <w:r>
-        <w:t xml:space="preserve">Ecuación </w:t>
-      </w:r>
-      <w:r>
-        <w:rPr>
+        <w:rPr>
+          <w:i/>
           <w:noProof/>
         </w:rPr>
         <w:t>3</w:t>
@@ -23636,260 +23990,359 @@
         <w:fldChar w:fldCharType="end"/>
       </w:r>
       <w:r>
-        <w:t>:</w:t>
-      </w:r>
-    </w:p>
-    <w:p>
-      <w:pPr>
-        <w:keepNext/>
-        <w:jc w:val="center"/>
-      </w:pPr>
-      <m:oMathPara>
-        <m:oMath>
-          <m:r>
-            <w:rPr>
-              <w:rFonts w:ascii="Cambria Math" w:hAnsi="Cambria Math"/>
-            </w:rPr>
-            <m:t xml:space="preserve">Loss= </m:t>
-          </m:r>
-          <m:nary>
-            <m:naryPr>
-              <m:chr m:val="∑"/>
-              <m:limLoc m:val="undOvr"/>
-              <m:ctrlPr>
-                <w:rPr>
-                  <w:rFonts w:ascii="Cambria Math" w:hAnsi="Cambria Math"/>
-                  <w:i/>
-                </w:rPr>
-              </m:ctrlPr>
-            </m:naryPr>
-            <m:sub>
-              <m:r>
-                <w:rPr>
-                  <w:rFonts w:ascii="Cambria Math" w:hAnsi="Cambria Math"/>
-                </w:rPr>
-                <m:t>i=1</m:t>
-              </m:r>
-            </m:sub>
-            <m:sup>
-              <m:r>
-                <w:rPr>
-                  <w:rFonts w:ascii="Cambria Math" w:hAnsi="Cambria Math"/>
-                </w:rPr>
-                <m:t>n</m:t>
-              </m:r>
-            </m:sup>
-            <m:e>
-              <m:sSup>
-                <m:sSupPr>
-                  <m:ctrlPr>
-                    <w:rPr>
-                      <w:rFonts w:ascii="Cambria Math" w:hAnsi="Cambria Math"/>
-                      <w:i/>
-                    </w:rPr>
-                  </m:ctrlPr>
-                </m:sSupPr>
-                <m:e>
-                  <m:r>
-                    <w:rPr>
-                      <w:rFonts w:ascii="Cambria Math" w:hAnsi="Cambria Math"/>
-                    </w:rPr>
-                    <m:t>(</m:t>
-                  </m:r>
-                  <m:sSub>
-                    <m:sSubPr>
-                      <m:ctrlPr>
-                        <w:rPr>
-                          <w:rFonts w:ascii="Cambria Math" w:hAnsi="Cambria Math"/>
-                          <w:i/>
-                        </w:rPr>
-                      </m:ctrlPr>
-                    </m:sSubPr>
-                    <m:e>
-                      <m:r>
-                        <w:rPr>
-                          <w:rFonts w:ascii="Cambria Math" w:hAnsi="Cambria Math"/>
-                        </w:rPr>
-                        <m:t>y</m:t>
-                      </m:r>
-                    </m:e>
-                    <m:sub>
-                      <m:r>
-                        <w:rPr>
-                          <w:rFonts w:ascii="Cambria Math" w:hAnsi="Cambria Math"/>
-                        </w:rPr>
-                        <m:t>i</m:t>
-                      </m:r>
-                    </m:sub>
-                  </m:sSub>
-                  <m:r>
-                    <w:rPr>
-                      <w:rFonts w:ascii="Cambria Math" w:hAnsi="Cambria Math"/>
-                    </w:rPr>
-                    <m:t>-</m:t>
-                  </m:r>
-                  <m:sSub>
-                    <m:sSubPr>
-                      <m:ctrlPr>
-                        <w:rPr>
-                          <w:rFonts w:ascii="Cambria Math" w:hAnsi="Cambria Math"/>
-                          <w:i/>
-                        </w:rPr>
-                      </m:ctrlPr>
-                    </m:sSubPr>
-                    <m:e>
-                      <m:acc>
-                        <m:accPr>
-                          <m:ctrlPr>
-                            <w:rPr>
-                              <w:rFonts w:ascii="Cambria Math" w:hAnsi="Cambria Math"/>
-                              <w:i/>
-                            </w:rPr>
-                          </m:ctrlPr>
-                        </m:accPr>
-                        <m:e>
-                          <m:r>
-                            <w:rPr>
-                              <w:rFonts w:ascii="Cambria Math" w:hAnsi="Cambria Math"/>
-                            </w:rPr>
-                            <m:t>y</m:t>
-                          </m:r>
-                        </m:e>
-                      </m:acc>
-                    </m:e>
-                    <m:sub>
-                      <m:r>
-                        <w:rPr>
-                          <w:rFonts w:ascii="Cambria Math" w:hAnsi="Cambria Math"/>
-                        </w:rPr>
-                        <m:t>i</m:t>
-                      </m:r>
-                    </m:sub>
-                  </m:sSub>
-                  <m:r>
-                    <w:rPr>
-                      <w:rFonts w:ascii="Cambria Math" w:hAnsi="Cambria Math"/>
-                    </w:rPr>
-                    <m:t>)</m:t>
-                  </m:r>
-                </m:e>
-                <m:sup>
-                  <m:r>
-                    <w:rPr>
-                      <w:rFonts w:ascii="Cambria Math" w:hAnsi="Cambria Math"/>
-                    </w:rPr>
-                    <m:t>2</m:t>
-                  </m:r>
-                </m:sup>
-              </m:sSup>
-              <m:r>
-                <w:rPr>
-                  <w:rFonts w:ascii="Cambria Math" w:hAnsi="Cambria Math"/>
-                </w:rPr>
-                <m:t>+λ</m:t>
-              </m:r>
-              <m:nary>
-                <m:naryPr>
-                  <m:chr m:val="∑"/>
-                  <m:limLoc m:val="undOvr"/>
-                  <m:ctrlPr>
-                    <w:rPr>
-                      <w:rFonts w:ascii="Cambria Math" w:hAnsi="Cambria Math"/>
-                      <w:i/>
-                    </w:rPr>
-                  </m:ctrlPr>
-                </m:naryPr>
-                <m:sub>
-                  <m:r>
-                    <w:rPr>
-                      <w:rFonts w:ascii="Cambria Math" w:hAnsi="Cambria Math"/>
-                    </w:rPr>
-                    <m:t>j=1</m:t>
-                  </m:r>
-                </m:sub>
-                <m:sup>
-                  <m:r>
-                    <w:rPr>
-                      <w:rFonts w:ascii="Cambria Math" w:hAnsi="Cambria Math"/>
-                    </w:rPr>
-                    <m:t>p</m:t>
-                  </m:r>
-                </m:sup>
-                <m:e>
-                  <m:r>
-                    <w:rPr>
-                      <w:rFonts w:ascii="Cambria Math" w:hAnsi="Cambria Math"/>
-                    </w:rPr>
-                    <m:t>|</m:t>
-                  </m:r>
-                  <m:sSub>
-                    <m:sSubPr>
-                      <m:ctrlPr>
-                        <w:rPr>
-                          <w:rFonts w:ascii="Cambria Math" w:hAnsi="Cambria Math"/>
-                          <w:i/>
-                        </w:rPr>
-                      </m:ctrlPr>
-                    </m:sSubPr>
-                    <m:e>
-                      <m:r>
-                        <w:rPr>
-                          <w:rFonts w:ascii="Cambria Math" w:hAnsi="Cambria Math"/>
-                        </w:rPr>
-                        <m:t>β</m:t>
-                      </m:r>
-                    </m:e>
-                    <m:sub>
-                      <m:r>
-                        <w:rPr>
-                          <w:rFonts w:ascii="Cambria Math" w:hAnsi="Cambria Math"/>
-                        </w:rPr>
-                        <m:t>j</m:t>
-                      </m:r>
-                    </m:sub>
-                  </m:sSub>
-                  <m:r>
-                    <w:rPr>
-                      <w:rFonts w:ascii="Cambria Math" w:hAnsi="Cambria Math"/>
-                    </w:rPr>
-                    <m:t>|</m:t>
-                  </m:r>
-                </m:e>
-              </m:nary>
-            </m:e>
-          </m:nary>
-        </m:oMath>
-      </m:oMathPara>
-    </w:p>
-    <w:p>
-      <w:pPr>
-        <w:pStyle w:val="Descripcin"/>
-        <w:jc w:val="center"/>
-      </w:pPr>
-      <w:bookmarkStart w:id="105" w:name="_Ref235633596"/>
-      <w:bookmarkStart w:id="106" w:name="_Ref235633581"/>
-      <w:bookmarkStart w:id="107" w:name="_Toc235867475"/>
-      <w:r>
-        <w:t xml:space="preserve">Ecuación </w:t>
-      </w:r>
-      <w:fldSimple w:instr=" SEQ Ecuación \* ARABIC ">
-        <w:r>
-          <w:rPr>
-            <w:noProof/>
-          </w:rPr>
-          <w:t>3</w:t>
-        </w:r>
-      </w:fldSimple>
-      <w:bookmarkEnd w:id="105"/>
-      <w:r>
-        <w:t xml:space="preserve"> - Función de Pérdida</w:t>
-      </w:r>
-      <w:bookmarkEnd w:id="106"/>
-      <w:bookmarkEnd w:id="107"/>
-    </w:p>
-    <w:p>
-      <w:r>
-        <w:lastRenderedPageBreak/>
+        <w:t>)</w:t>
+      </w:r>
+      <w:r>
+        <w:fldChar w:fldCharType="begin"/>
+      </w:r>
+      <w:r>
+        <w:instrText xml:space="preserve"> REF bookmark=id.5dgs8ni79cte \h </w:instrText>
+      </w:r>
+      <w:r>
+        <w:fldChar w:fldCharType="end"/>
+      </w:r>
+    </w:p>
+    <w:tbl>
+      <w:tblPr>
+        <w:tblStyle w:val="Tablaconcuadrcula"/>
+        <w:tblW w:w="0" w:type="auto"/>
+        <w:tblBorders>
+          <w:top w:val="none" w:sz="0" w:space="0" w:color="auto"/>
+          <w:left w:val="none" w:sz="0" w:space="0" w:color="auto"/>
+          <w:bottom w:val="none" w:sz="0" w:space="0" w:color="auto"/>
+          <w:right w:val="none" w:sz="0" w:space="0" w:color="auto"/>
+          <w:insideH w:val="none" w:sz="0" w:space="0" w:color="auto"/>
+          <w:insideV w:val="none" w:sz="0" w:space="0" w:color="auto"/>
+        </w:tblBorders>
+        <w:tblLook w:val="04A0" w:firstRow="1" w:lastRow="0" w:firstColumn="1" w:lastColumn="0" w:noHBand="0" w:noVBand="1"/>
+      </w:tblPr>
+      <w:tblGrid>
+        <w:gridCol w:w="1134"/>
+        <w:gridCol w:w="7938"/>
+        <w:gridCol w:w="890"/>
+      </w:tblGrid>
+      <w:tr>
+        <w:tc>
+          <w:tcPr>
+            <w:tcW w:w="1134" w:type="dxa"/>
+          </w:tcPr>
+          <w:p/>
+        </w:tc>
+        <w:tc>
+          <w:tcPr>
+            <w:tcW w:w="7938" w:type="dxa"/>
+          </w:tcPr>
+          <w:p>
+            <w:pPr>
+              <w:keepNext/>
+              <w:jc w:val="center"/>
+            </w:pPr>
+            <m:oMathPara>
+              <m:oMath>
+                <m:r>
+                  <w:rPr>
+                    <w:rFonts w:ascii="Cambria Math" w:hAnsi="Cambria Math"/>
+                  </w:rPr>
+                  <m:t xml:space="preserve">Loss= </m:t>
+                </m:r>
+                <m:nary>
+                  <m:naryPr>
+                    <m:chr m:val="∑"/>
+                    <m:limLoc m:val="undOvr"/>
+                    <m:ctrlPr>
+                      <w:rPr>
+                        <w:rFonts w:ascii="Cambria Math" w:hAnsi="Cambria Math"/>
+                        <w:i/>
+                      </w:rPr>
+                    </m:ctrlPr>
+                  </m:naryPr>
+                  <m:sub>
+                    <m:r>
+                      <w:rPr>
+                        <w:rFonts w:ascii="Cambria Math" w:hAnsi="Cambria Math"/>
+                      </w:rPr>
+                      <m:t>i=1</m:t>
+                    </m:r>
+                  </m:sub>
+                  <m:sup>
+                    <m:r>
+                      <w:rPr>
+                        <w:rFonts w:ascii="Cambria Math" w:hAnsi="Cambria Math"/>
+                      </w:rPr>
+                      <m:t>n</m:t>
+                    </m:r>
+                  </m:sup>
+                  <m:e>
+                    <m:sSup>
+                      <m:sSupPr>
+                        <m:ctrlPr>
+                          <w:rPr>
+                            <w:rFonts w:ascii="Cambria Math" w:hAnsi="Cambria Math"/>
+                            <w:i/>
+                          </w:rPr>
+                        </m:ctrlPr>
+                      </m:sSupPr>
+                      <m:e>
+                        <m:r>
+                          <w:rPr>
+                            <w:rFonts w:ascii="Cambria Math" w:hAnsi="Cambria Math"/>
+                          </w:rPr>
+                          <m:t>(</m:t>
+                        </m:r>
+                        <m:sSub>
+                          <m:sSubPr>
+                            <m:ctrlPr>
+                              <w:rPr>
+                                <w:rFonts w:ascii="Cambria Math" w:hAnsi="Cambria Math"/>
+                                <w:i/>
+                              </w:rPr>
+                            </m:ctrlPr>
+                          </m:sSubPr>
+                          <m:e>
+                            <m:r>
+                              <w:rPr>
+                                <w:rFonts w:ascii="Cambria Math" w:hAnsi="Cambria Math"/>
+                              </w:rPr>
+                              <m:t>y</m:t>
+                            </m:r>
+                          </m:e>
+                          <m:sub>
+                            <m:r>
+                              <w:rPr>
+                                <w:rFonts w:ascii="Cambria Math" w:hAnsi="Cambria Math"/>
+                              </w:rPr>
+                              <m:t>i</m:t>
+                            </m:r>
+                          </m:sub>
+                        </m:sSub>
+                        <m:r>
+                          <w:rPr>
+                            <w:rFonts w:ascii="Cambria Math" w:hAnsi="Cambria Math"/>
+                          </w:rPr>
+                          <m:t>-</m:t>
+                        </m:r>
+                        <m:sSub>
+                          <m:sSubPr>
+                            <m:ctrlPr>
+                              <w:rPr>
+                                <w:rFonts w:ascii="Cambria Math" w:hAnsi="Cambria Math"/>
+                                <w:i/>
+                              </w:rPr>
+                            </m:ctrlPr>
+                          </m:sSubPr>
+                          <m:e>
+                            <m:acc>
+                              <m:accPr>
+                                <m:ctrlPr>
+                                  <w:rPr>
+                                    <w:rFonts w:ascii="Cambria Math" w:hAnsi="Cambria Math"/>
+                                    <w:i/>
+                                  </w:rPr>
+                                </m:ctrlPr>
+                              </m:accPr>
+                              <m:e>
+                                <m:r>
+                                  <w:rPr>
+                                    <w:rFonts w:ascii="Cambria Math" w:hAnsi="Cambria Math"/>
+                                  </w:rPr>
+                                  <m:t>y</m:t>
+                                </m:r>
+                              </m:e>
+                            </m:acc>
+                          </m:e>
+                          <m:sub>
+                            <m:r>
+                              <w:rPr>
+                                <w:rFonts w:ascii="Cambria Math" w:hAnsi="Cambria Math"/>
+                              </w:rPr>
+                              <m:t>i</m:t>
+                            </m:r>
+                          </m:sub>
+                        </m:sSub>
+                        <m:r>
+                          <w:rPr>
+                            <w:rFonts w:ascii="Cambria Math" w:hAnsi="Cambria Math"/>
+                          </w:rPr>
+                          <m:t>)</m:t>
+                        </m:r>
+                      </m:e>
+                      <m:sup>
+                        <m:r>
+                          <w:rPr>
+                            <w:rFonts w:ascii="Cambria Math" w:hAnsi="Cambria Math"/>
+                          </w:rPr>
+                          <m:t>2</m:t>
+                        </m:r>
+                      </m:sup>
+                    </m:sSup>
+                    <m:r>
+                      <w:rPr>
+                        <w:rFonts w:ascii="Cambria Math" w:hAnsi="Cambria Math"/>
+                      </w:rPr>
+                      <m:t>+λ</m:t>
+                    </m:r>
+                    <m:nary>
+                      <m:naryPr>
+                        <m:chr m:val="∑"/>
+                        <m:limLoc m:val="undOvr"/>
+                        <m:ctrlPr>
+                          <w:rPr>
+                            <w:rFonts w:ascii="Cambria Math" w:hAnsi="Cambria Math"/>
+                            <w:i/>
+                          </w:rPr>
+                        </m:ctrlPr>
+                      </m:naryPr>
+                      <m:sub>
+                        <m:r>
+                          <w:rPr>
+                            <w:rFonts w:ascii="Cambria Math" w:hAnsi="Cambria Math"/>
+                          </w:rPr>
+                          <m:t>j=1</m:t>
+                        </m:r>
+                      </m:sub>
+                      <m:sup>
+                        <m:r>
+                          <w:rPr>
+                            <w:rFonts w:ascii="Cambria Math" w:hAnsi="Cambria Math"/>
+                          </w:rPr>
+                          <m:t>p</m:t>
+                        </m:r>
+                      </m:sup>
+                      <m:e>
+                        <m:r>
+                          <w:rPr>
+                            <w:rFonts w:ascii="Cambria Math" w:hAnsi="Cambria Math"/>
+                          </w:rPr>
+                          <m:t>|</m:t>
+                        </m:r>
+                        <m:sSub>
+                          <m:sSubPr>
+                            <m:ctrlPr>
+                              <w:rPr>
+                                <w:rFonts w:ascii="Cambria Math" w:hAnsi="Cambria Math"/>
+                                <w:i/>
+                              </w:rPr>
+                            </m:ctrlPr>
+                          </m:sSubPr>
+                          <m:e>
+                            <m:r>
+                              <w:rPr>
+                                <w:rFonts w:ascii="Cambria Math" w:hAnsi="Cambria Math"/>
+                              </w:rPr>
+                              <m:t>β</m:t>
+                            </m:r>
+                          </m:e>
+                          <m:sub>
+                            <m:r>
+                              <w:rPr>
+                                <w:rFonts w:ascii="Cambria Math" w:hAnsi="Cambria Math"/>
+                              </w:rPr>
+                              <m:t>j</m:t>
+                            </m:r>
+                          </m:sub>
+                        </m:sSub>
+                        <m:r>
+                          <w:rPr>
+                            <w:rFonts w:ascii="Cambria Math" w:hAnsi="Cambria Math"/>
+                          </w:rPr>
+                          <m:t>|</m:t>
+                        </m:r>
+                      </m:e>
+                    </m:nary>
+                  </m:e>
+                </m:nary>
+              </m:oMath>
+            </m:oMathPara>
+          </w:p>
+          <w:p/>
+        </w:tc>
+        <w:tc>
+          <w:tcPr>
+            <w:tcW w:w="890" w:type="dxa"/>
+          </w:tcPr>
+          <w:p>
+            <w:pPr>
+              <w:pStyle w:val="Descripcin"/>
+              <w:jc w:val="right"/>
+              <w:rPr>
+                <w:i w:val="0"/>
+                <w:sz w:val="24"/>
+                <w:szCs w:val="24"/>
+              </w:rPr>
+            </w:pPr>
+            <w:r>
+              <w:rPr>
+                <w:i w:val="0"/>
+                <w:sz w:val="24"/>
+                <w:szCs w:val="24"/>
+              </w:rPr>
+              <w:t>(</w:t>
+            </w:r>
+            <w:bookmarkStart w:id="102" w:name="Ec_RegressionLasso"/>
+            <w:r>
+              <w:rPr>
+                <w:i w:val="0"/>
+                <w:sz w:val="24"/>
+                <w:szCs w:val="24"/>
+              </w:rPr>
+              <w:fldChar w:fldCharType="begin"/>
+            </w:r>
+            <w:r>
+              <w:rPr>
+                <w:i w:val="0"/>
+                <w:sz w:val="24"/>
+                <w:szCs w:val="24"/>
+              </w:rPr>
+              <w:instrText>SEQ Ecuacion \* ARABIC</w:instrText>
+            </w:r>
+            <w:r>
+              <w:rPr>
+                <w:i w:val="0"/>
+                <w:sz w:val="24"/>
+                <w:szCs w:val="24"/>
+              </w:rPr>
+              <w:instrText xml:space="preserve"> </w:instrText>
+            </w:r>
+            <w:r>
+              <w:rPr>
+                <w:i w:val="0"/>
+                <w:sz w:val="24"/>
+                <w:szCs w:val="24"/>
+              </w:rPr>
+              <w:fldChar w:fldCharType="separate"/>
+            </w:r>
+            <w:r>
+              <w:rPr>
+                <w:i w:val="0"/>
+                <w:noProof/>
+                <w:sz w:val="24"/>
+                <w:szCs w:val="24"/>
+              </w:rPr>
+              <w:t>3</w:t>
+            </w:r>
+            <w:r>
+              <w:rPr>
+                <w:i w:val="0"/>
+                <w:sz w:val="24"/>
+                <w:szCs w:val="24"/>
+              </w:rPr>
+              <w:fldChar w:fldCharType="end"/>
+            </w:r>
+            <w:bookmarkEnd w:id="102"/>
+            <w:r>
+              <w:rPr>
+                <w:i w:val="0"/>
+                <w:sz w:val="24"/>
+                <w:szCs w:val="24"/>
+              </w:rPr>
+              <w:t>)</w:t>
+            </w:r>
+          </w:p>
+        </w:tc>
+      </w:tr>
+    </w:tbl>
+    <w:p>
+      <w:r>
         <w:t xml:space="preserve">El parámetro de ajuste estocástico </w:t>
       </w:r>
       <m:oMath>
@@ -23906,6 +24359,7 @@
     </w:p>
     <w:p>
       <w:r>
+        <w:lastRenderedPageBreak/>
         <w:t xml:space="preserve">Al emplear regularización u optimización de </w:t>
       </w:r>
       <w:proofErr w:type="spellStart"/>
@@ -23935,8 +24389,8 @@
           <w:numId w:val="19"/>
         </w:numPr>
       </w:pPr>
-      <w:bookmarkStart w:id="108" w:name="_Toc233383607"/>
-      <w:bookmarkStart w:id="109" w:name="_Toc235808069"/>
+      <w:bookmarkStart w:id="103" w:name="_Toc233383607"/>
+      <w:bookmarkStart w:id="104" w:name="_Toc235808069"/>
       <w:r>
         <w:t>Ingeniería de Características (</w:t>
       </w:r>
@@ -23968,8 +24422,8 @@
       <w:r>
         <w:t>): La Incorporación Heurística del Conocimiento Tácito</w:t>
       </w:r>
-      <w:bookmarkEnd w:id="108"/>
-      <w:bookmarkEnd w:id="109"/>
+      <w:bookmarkEnd w:id="103"/>
+      <w:bookmarkEnd w:id="104"/>
     </w:p>
     <w:p>
       <w:r>
@@ -24207,24 +24661,21 @@
         </m:r>
       </m:oMath>
       <w:r>
-        <w:t xml:space="preserve"> para la demanda del mismo día de la semana anterior). Asimismo, para suavizar anomalías, se </w:t>
-      </w:r>
+        <w:t xml:space="preserve"> para la demanda del mismo día de la semana anterior). Asimismo, para suavizar anomalías, se calculan medias móviles de distintos periodos (promedio de los últimos 3, 7 o 15 días), lo que proporciona al algoritmo la inercia a corto plazo de la tendencia de ingresos.</w:t>
+      </w:r>
+    </w:p>
+    <w:p>
+      <w:r>
+        <w:rPr>
+          <w:b/>
+          <w:bCs/>
+        </w:rPr>
+        <w:t>B. Transformaciones Cíclicas de Variables Temporales</w:t>
+      </w:r>
+    </w:p>
+    <w:p>
       <w:r>
         <w:lastRenderedPageBreak/>
-        <w:t>calculan medias móviles de distintos periodos (promedio de los últimos 3, 7 o 15 días), lo que proporciona al algoritmo la inercia a corto plazo de la tendencia de ingresos.</w:t>
-      </w:r>
-    </w:p>
-    <w:p>
-      <w:r>
-        <w:rPr>
-          <w:b/>
-          <w:bCs/>
-        </w:rPr>
-        <w:t>B. Transformaciones Cíclicas de Variables Temporales</w:t>
-      </w:r>
-    </w:p>
-    <w:p>
-      <w:r>
         <w:t xml:space="preserve">La demanda de </w:t>
       </w:r>
       <w:proofErr w:type="spellStart"/>
@@ -24233,7 +24684,15 @@
       </w:r>
       <w:proofErr w:type="spellEnd"/>
       <w:r>
-        <w:t xml:space="preserve"> presenta fuerte dependencia del día de la semana y el mes del año. No obstante, introducir estas variables como etiquetas numéricas ordinales simples (ej. Lunes = 1, Domingo = 7) es un error matemático grave, pues el algoritmo no entenderá que el Domingo (7) y el Lunes (1) son días temporalmente adyacentes. La Ingeniería de Características soluciona esto mediante codificación trigonométrica, proyectando la variable temporal en un círculo de dos dimensiones usando </w:t>
+        <w:t xml:space="preserve"> presenta fuerte dependencia del día de la semana y el mes del año. No obstante, introducir estas variables como etiquetas numéricas ordinales simples (ej. Lunes = 1, Domingo = 7) es un error matemático grave, pues el algoritmo no entenderá que el Domingo (7) y el </w:t>
+      </w:r>
+      <w:proofErr w:type="gramStart"/>
+      <w:r>
+        <w:t>Lunes</w:t>
+      </w:r>
+      <w:proofErr w:type="gramEnd"/>
+      <w:r>
+        <w:t xml:space="preserve"> (1) son días temporalmente adyacentes. La Ingeniería de Características soluciona esto mediante codificación trigonométrica, proyectando la variable temporal en un círculo de dos dimensiones usando </w:t>
       </w:r>
       <w:r>
         <w:t>la</w:t>
@@ -24481,8 +24940,8 @@
         <w:pStyle w:val="Descripcin"/>
         <w:jc w:val="center"/>
       </w:pPr>
-      <w:bookmarkStart w:id="110" w:name="_Ref235633693"/>
-      <w:bookmarkStart w:id="111" w:name="_Toc235867476"/>
+      <w:bookmarkStart w:id="105" w:name="_Ref235633693"/>
+      <w:bookmarkStart w:id="106" w:name="_Toc235867476"/>
       <w:r>
         <w:t xml:space="preserve">Ecuación </w:t>
       </w:r>
@@ -24503,8 +24962,8 @@
       <w:r>
         <w:t>/ Coseno de x</w:t>
       </w:r>
-      <w:bookmarkEnd w:id="110"/>
-      <w:bookmarkEnd w:id="111"/>
+      <w:bookmarkEnd w:id="105"/>
+      <w:bookmarkEnd w:id="106"/>
     </w:p>
     <w:p>
       <w:r>
@@ -24583,8 +25042,8 @@
           <w:numId w:val="19"/>
         </w:numPr>
       </w:pPr>
-      <w:bookmarkStart w:id="112" w:name="_Toc233383608"/>
-      <w:bookmarkStart w:id="113" w:name="_Toc235808070"/>
+      <w:bookmarkStart w:id="107" w:name="_Toc233383608"/>
+      <w:bookmarkStart w:id="108" w:name="_Toc235808070"/>
       <w:r>
         <w:t>Validación Temporal Estricta: Metodología de Ventanas Deslizantes (</w:t>
       </w:r>
@@ -24607,16 +25066,12 @@
       <w:r>
         <w:t>)</w:t>
       </w:r>
-      <w:bookmarkEnd w:id="112"/>
-      <w:bookmarkEnd w:id="113"/>
-    </w:p>
-    <w:p>
-      <w:r>
-        <w:t xml:space="preserve">Una vez que los modelos han sido diseñados y regularizados, el paso final en la cimentación de su arquitectura técnica es la evaluación rigurosa de su rendimiento antes de desplegarlos en el entorno productivo real. En conjuntos de datos independientes tradicionales, el estándar </w:t>
-      </w:r>
-      <w:r>
-        <w:lastRenderedPageBreak/>
-        <w:t xml:space="preserve">estadístico es la validación cruzada </w:t>
+      <w:bookmarkEnd w:id="107"/>
+      <w:bookmarkEnd w:id="108"/>
+    </w:p>
+    <w:p>
+      <w:r>
+        <w:t xml:space="preserve">Una vez que los modelos han sido diseñados y regularizados, el paso final en la cimentación de su arquitectura técnica es la evaluación rigurosa de su rendimiento antes de desplegarlos en el entorno productivo real. En conjuntos de datos independientes tradicionales, el estándar estadístico es la validación cruzada </w:t>
       </w:r>
       <w:r>
         <w:rPr>
@@ -24685,7 +25140,11 @@
         <w:t>(2012)</w:t>
       </w:r>
       <w:r>
-        <w:t xml:space="preserve"> demostraron de forma taxativa que aplicar el muestreo aleatorio de validación cruzada en datos secuenciales constituye un error analítico insalvable. Mezclar aleatoriamente las ventas de enero y diciembre para predecir marzo destruye la dependencia de las series de tiempo y genera un fenómeno denominado "fuga de datos" (</w:t>
+        <w:t xml:space="preserve"> demostraron de forma taxativa que aplicar el muestreo aleatorio de validación cruzada en datos secuenciales constituye un error analítico insalvable. Mezclar aleatoriamente las ventas de enero y diciembre para predecir marzo destruye la dependencia de las series de tiempo y </w:t>
+      </w:r>
+      <w:r>
+        <w:lastRenderedPageBreak/>
+        <w:t>genera un fenómeno denominado "fuga de datos" (</w:t>
       </w:r>
       <w:r>
         <w:rPr>
@@ -24913,11 +25372,18 @@
           <w:b/>
           <w:bCs/>
         </w:rPr>
-        <w:lastRenderedPageBreak/>
         <w:t>Leonard Tashman (2000)</w:t>
       </w:r>
       <w:r>
-        <w:t xml:space="preserve"> subraya que en entornos de pequeñas organizaciones, se puede optar por una </w:t>
+        <w:t xml:space="preserve"> subraya </w:t>
+      </w:r>
+      <w:proofErr w:type="gramStart"/>
+      <w:r>
+        <w:t>que</w:t>
+      </w:r>
+      <w:proofErr w:type="gramEnd"/>
+      <w:r>
+        <w:t xml:space="preserve"> en entornos de pequeñas organizaciones, se puede optar por una </w:t>
       </w:r>
       <w:r>
         <w:rPr>
@@ -24969,6 +25435,7 @@
     </w:p>
     <w:p>
       <w:r>
+        <w:lastRenderedPageBreak/>
         <w:t>La aplicación de esta metodología es el pilar de validez científica de la presente investigación. Al calcular el Error Absoluto Medio (</w:t>
       </w:r>
       <w:r>
@@ -25017,13 +25484,13 @@
           <w:numId w:val="19"/>
         </w:numPr>
       </w:pPr>
-      <w:bookmarkStart w:id="114" w:name="_Toc233383609"/>
-      <w:bookmarkStart w:id="115" w:name="_Toc235808071"/>
+      <w:bookmarkStart w:id="109" w:name="_Toc233383609"/>
+      <w:bookmarkStart w:id="110" w:name="_Toc235808071"/>
       <w:r>
         <w:t>Conclusión</w:t>
       </w:r>
-      <w:bookmarkEnd w:id="114"/>
-      <w:bookmarkEnd w:id="115"/>
+      <w:bookmarkEnd w:id="109"/>
+      <w:bookmarkEnd w:id="110"/>
     </w:p>
     <w:p>
       <w:r>
@@ -25066,7 +25533,6 @@
     </w:p>
     <w:p>
       <w:r>
-        <w:lastRenderedPageBreak/>
         <w:t xml:space="preserve">Este andamiaje técnico metodológico conforma el puente definitivo para </w:t>
       </w:r>
       <w:proofErr w:type="spellStart"/>
@@ -25086,13 +25552,14 @@
           <w:numId w:val="19"/>
         </w:numPr>
       </w:pPr>
-      <w:bookmarkStart w:id="116" w:name="_Toc233383610"/>
-      <w:bookmarkStart w:id="117" w:name="_Toc235808072"/>
-      <w:r>
+      <w:bookmarkStart w:id="111" w:name="_Toc233383610"/>
+      <w:bookmarkStart w:id="112" w:name="_Toc235808072"/>
+      <w:r>
+        <w:lastRenderedPageBreak/>
         <w:t>Métricas de evaluación de modelos predictivos</w:t>
       </w:r>
-      <w:bookmarkEnd w:id="116"/>
-      <w:bookmarkEnd w:id="117"/>
+      <w:bookmarkEnd w:id="111"/>
+      <w:bookmarkEnd w:id="112"/>
     </w:p>
     <w:p>
       <w:r>
@@ -25404,8 +25871,8 @@
         <w:pStyle w:val="Descripcin"/>
         <w:jc w:val="center"/>
       </w:pPr>
-      <w:bookmarkStart w:id="118" w:name="_Ref235633779"/>
-      <w:bookmarkStart w:id="119" w:name="_Toc235867477"/>
+      <w:bookmarkStart w:id="113" w:name="_Toc235867477"/>
+      <w:bookmarkStart w:id="114" w:name="_Ref235633779"/>
       <w:r>
         <w:t xml:space="preserve">Ecuación </w:t>
       </w:r>
@@ -25417,11 +25884,11 @@
           <w:t>5</w:t>
         </w:r>
       </w:fldSimple>
-      <w:bookmarkEnd w:id="118"/>
+      <w:bookmarkEnd w:id="114"/>
       <w:r>
         <w:t xml:space="preserve"> - Error Absoluto Medio (MAE)</w:t>
       </w:r>
-      <w:bookmarkEnd w:id="119"/>
+      <w:bookmarkEnd w:id="113"/>
     </w:p>
     <w:p>
       <w:pPr>
@@ -25710,8 +26177,8 @@
         <w:pStyle w:val="Descripcin"/>
         <w:jc w:val="center"/>
       </w:pPr>
-      <w:bookmarkStart w:id="120" w:name="_Ref235633852"/>
-      <w:bookmarkStart w:id="121" w:name="_Toc235867478"/>
+      <w:bookmarkStart w:id="115" w:name="_Toc235867478"/>
+      <w:bookmarkStart w:id="116" w:name="_Ref235633852"/>
       <w:r>
         <w:t xml:space="preserve">Ecuación </w:t>
       </w:r>
@@ -25723,11 +26190,11 @@
           <w:t>6</w:t>
         </w:r>
       </w:fldSimple>
-      <w:bookmarkEnd w:id="120"/>
+      <w:bookmarkEnd w:id="116"/>
       <w:r>
         <w:t xml:space="preserve"> - Raíz del Error Cuadrático Medio (RMSE)</w:t>
       </w:r>
-      <w:bookmarkEnd w:id="121"/>
+      <w:bookmarkEnd w:id="115"/>
     </w:p>
     <w:p>
       <w:pPr>
@@ -26025,9 +26492,9 @@
         <w:pStyle w:val="Descripcin"/>
         <w:jc w:val="center"/>
       </w:pPr>
-      <w:bookmarkStart w:id="122" w:name="_Ref235634578"/>
-      <w:bookmarkStart w:id="123" w:name="_Toc235867479"/>
-      <w:bookmarkStart w:id="124" w:name="_Toc233383611"/>
+      <w:bookmarkStart w:id="117" w:name="_Toc235867479"/>
+      <w:bookmarkStart w:id="118" w:name="_Toc233383611"/>
+      <w:bookmarkStart w:id="119" w:name="_Ref235634578"/>
       <w:r>
         <w:t xml:space="preserve">Ecuación </w:t>
       </w:r>
@@ -26039,7 +26506,7 @@
           <w:t>7</w:t>
         </w:r>
       </w:fldSimple>
-      <w:bookmarkEnd w:id="122"/>
+      <w:bookmarkEnd w:id="119"/>
       <w:r>
         <w:t xml:space="preserve"> - E</w:t>
       </w:r>
@@ -26049,7 +26516,7 @@
         </w:rPr>
         <w:t>rror Porcentual Absoluto Medio (MAPE)</w:t>
       </w:r>
-      <w:bookmarkEnd w:id="123"/>
+      <w:bookmarkEnd w:id="117"/>
     </w:p>
     <w:p>
       <w:pPr>
@@ -26059,12 +26526,12 @@
           <w:numId w:val="19"/>
         </w:numPr>
       </w:pPr>
-      <w:bookmarkStart w:id="125" w:name="_Toc235808073"/>
+      <w:bookmarkStart w:id="120" w:name="_Toc235808073"/>
       <w:r>
         <w:t>Fundamentos Epistemológicos de la Medición del Error Predictivo</w:t>
       </w:r>
-      <w:bookmarkEnd w:id="124"/>
-      <w:bookmarkEnd w:id="125"/>
+      <w:bookmarkEnd w:id="118"/>
+      <w:bookmarkEnd w:id="120"/>
     </w:p>
     <w:p>
       <w:r>
@@ -26426,8 +26893,8 @@
           <w:numId w:val="19"/>
         </w:numPr>
       </w:pPr>
-      <w:bookmarkStart w:id="126" w:name="_Toc233383612"/>
-      <w:bookmarkStart w:id="127" w:name="_Toc235808074"/>
+      <w:bookmarkStart w:id="121" w:name="_Toc233383612"/>
+      <w:bookmarkStart w:id="122" w:name="_Toc235808074"/>
       <w:r>
         <w:t>Error Absoluto Medio (</w:t>
       </w:r>
@@ -26441,8 +26908,8 @@
       <w:r>
         <w:t>) y la Magnitud Lineal del Riesgo Operativo</w:t>
       </w:r>
-      <w:bookmarkEnd w:id="126"/>
-      <w:bookmarkEnd w:id="127"/>
+      <w:bookmarkEnd w:id="121"/>
+      <w:bookmarkEnd w:id="122"/>
     </w:p>
     <w:p>
       <w:r>
@@ -26669,8 +27136,8 @@
         <w:pStyle w:val="Descripcin"/>
         <w:jc w:val="center"/>
       </w:pPr>
-      <w:bookmarkStart w:id="128" w:name="_Ref235798613"/>
-      <w:bookmarkStart w:id="129" w:name="_Toc235867480"/>
+      <w:bookmarkStart w:id="123" w:name="_Toc235867480"/>
+      <w:bookmarkStart w:id="124" w:name="_Ref235798613"/>
       <w:r>
         <w:t xml:space="preserve">Ecuación </w:t>
       </w:r>
@@ -26682,11 +27149,11 @@
           <w:t>8</w:t>
         </w:r>
       </w:fldSimple>
-      <w:bookmarkEnd w:id="128"/>
+      <w:bookmarkEnd w:id="124"/>
       <w:r>
         <w:t xml:space="preserve"> Error Absoluto Medio (MAE)</w:t>
       </w:r>
-      <w:bookmarkEnd w:id="129"/>
+      <w:bookmarkEnd w:id="123"/>
     </w:p>
     <w:p>
       <w:r>
@@ -26850,8 +27317,8 @@
           <w:numId w:val="19"/>
         </w:numPr>
       </w:pPr>
-      <w:bookmarkStart w:id="130" w:name="_Toc233383613"/>
-      <w:bookmarkStart w:id="131" w:name="_Toc235808075"/>
+      <w:bookmarkStart w:id="125" w:name="_Toc233383613"/>
+      <w:bookmarkStart w:id="126" w:name="_Toc235808075"/>
       <w:r>
         <w:t>Raíz del Error Cuadrático Medio (</w:t>
       </w:r>
@@ -26865,8 +27332,8 @@
       <w:r>
         <w:t>) y la Penalización de Errores Catastróficos</w:t>
       </w:r>
-      <w:bookmarkEnd w:id="130"/>
-      <w:bookmarkEnd w:id="131"/>
+      <w:bookmarkEnd w:id="125"/>
+      <w:bookmarkEnd w:id="126"/>
     </w:p>
     <w:p>
       <w:r>
@@ -27160,8 +27627,8 @@
         <w:pStyle w:val="Descripcin"/>
         <w:jc w:val="center"/>
       </w:pPr>
-      <w:bookmarkStart w:id="132" w:name="_Ref235798674"/>
-      <w:bookmarkStart w:id="133" w:name="_Toc235867481"/>
+      <w:bookmarkStart w:id="127" w:name="_Toc235867481"/>
+      <w:bookmarkStart w:id="128" w:name="_Ref235798674"/>
       <w:r>
         <w:t xml:space="preserve">Ecuación </w:t>
       </w:r>
@@ -27173,11 +27640,11 @@
           <w:t>9</w:t>
         </w:r>
       </w:fldSimple>
-      <w:bookmarkEnd w:id="132"/>
+      <w:bookmarkEnd w:id="128"/>
       <w:r>
         <w:t xml:space="preserve"> - Raíz del Error Cuadrático Medio (RMSE)</w:t>
       </w:r>
-      <w:bookmarkEnd w:id="133"/>
+      <w:bookmarkEnd w:id="127"/>
     </w:p>
     <w:p>
       <w:r>
@@ -27287,13 +27754,13 @@
           <w:numId w:val="19"/>
         </w:numPr>
       </w:pPr>
-      <w:bookmarkStart w:id="134" w:name="_Toc233383614"/>
-      <w:bookmarkStart w:id="135" w:name="_Toc235808076"/>
+      <w:bookmarkStart w:id="129" w:name="_Toc233383614"/>
+      <w:bookmarkStart w:id="130" w:name="_Toc235808076"/>
       <w:r>
         <w:t>Error Porcentual Absoluto Medio (MAPE) y la Relatividad Comercial</w:t>
       </w:r>
-      <w:bookmarkEnd w:id="134"/>
-      <w:bookmarkEnd w:id="135"/>
+      <w:bookmarkEnd w:id="129"/>
+      <w:bookmarkEnd w:id="130"/>
     </w:p>
     <w:p>
       <w:r>
@@ -27574,8 +28041,8 @@
         <w:pStyle w:val="Descripcin"/>
         <w:jc w:val="center"/>
       </w:pPr>
-      <w:bookmarkStart w:id="136" w:name="_Ref235798729"/>
-      <w:bookmarkStart w:id="137" w:name="_Toc235867482"/>
+      <w:bookmarkStart w:id="131" w:name="_Toc235867482"/>
+      <w:bookmarkStart w:id="132" w:name="_Ref235798729"/>
       <w:r>
         <w:t xml:space="preserve">Ecuación </w:t>
       </w:r>
@@ -27587,11 +28054,11 @@
           <w:t>10</w:t>
         </w:r>
       </w:fldSimple>
-      <w:bookmarkEnd w:id="136"/>
+      <w:bookmarkEnd w:id="132"/>
       <w:r>
         <w:t xml:space="preserve"> - Error Porcentual Absoluto Medio (MAPE)</w:t>
       </w:r>
-      <w:bookmarkEnd w:id="137"/>
+      <w:bookmarkEnd w:id="131"/>
     </w:p>
     <w:p>
       <w:r>
@@ -27836,8 +28303,8 @@
           <w:numId w:val="19"/>
         </w:numPr>
       </w:pPr>
-      <w:bookmarkStart w:id="138" w:name="_Toc233383615"/>
-      <w:bookmarkStart w:id="139" w:name="_Toc235808077"/>
+      <w:bookmarkStart w:id="133" w:name="_Toc233383615"/>
+      <w:bookmarkStart w:id="134" w:name="_Toc235808077"/>
       <w:r>
         <w:t>Validación de Modelos en Series Temporales: Metodología de Ventanas Deslizantes (</w:t>
       </w:r>
@@ -27876,8 +28343,8 @@
       <w:r>
         <w:t>)</w:t>
       </w:r>
-      <w:bookmarkEnd w:id="138"/>
-      <w:bookmarkEnd w:id="139"/>
+      <w:bookmarkEnd w:id="133"/>
+      <w:bookmarkEnd w:id="134"/>
     </w:p>
     <w:p>
       <w:r>
@@ -28230,13 +28697,13 @@
           <w:numId w:val="19"/>
         </w:numPr>
       </w:pPr>
-      <w:bookmarkStart w:id="140" w:name="_Toc233383616"/>
-      <w:bookmarkStart w:id="141" w:name="_Toc235808078"/>
+      <w:bookmarkStart w:id="135" w:name="_Toc233383616"/>
+      <w:bookmarkStart w:id="136" w:name="_Toc235808078"/>
       <w:r>
         <w:t>Fusión Multicriterio y Evaluación Contra la Línea Base Empírica</w:t>
       </w:r>
-      <w:bookmarkEnd w:id="140"/>
-      <w:bookmarkEnd w:id="141"/>
+      <w:bookmarkEnd w:id="135"/>
+      <w:bookmarkEnd w:id="136"/>
     </w:p>
     <w:p>
       <w:r>
@@ -28501,8 +28968,8 @@
         <w:pStyle w:val="Descripcin"/>
         <w:jc w:val="center"/>
       </w:pPr>
-      <w:bookmarkStart w:id="142" w:name="_Ref235634711"/>
-      <w:bookmarkStart w:id="143" w:name="_Toc235867483"/>
+      <w:bookmarkStart w:id="137" w:name="_Toc235867483"/>
+      <w:bookmarkStart w:id="138" w:name="_Ref235634711"/>
       <w:r>
         <w:t xml:space="preserve">Ecuación </w:t>
       </w:r>
@@ -28514,11 +28981,11 @@
           <w:t>11</w:t>
         </w:r>
       </w:fldSimple>
-      <w:bookmarkEnd w:id="142"/>
+      <w:bookmarkEnd w:id="138"/>
       <w:r>
         <w:t xml:space="preserve"> - Delta de las métricas de error</w:t>
       </w:r>
-      <w:bookmarkEnd w:id="143"/>
+      <w:bookmarkEnd w:id="137"/>
     </w:p>
     <w:p>
       <w:r>
@@ -28602,13 +29069,13 @@
           <w:numId w:val="19"/>
         </w:numPr>
       </w:pPr>
-      <w:bookmarkStart w:id="144" w:name="_Toc233383617"/>
-      <w:bookmarkStart w:id="145" w:name="_Toc235808079"/>
+      <w:bookmarkStart w:id="139" w:name="_Toc233383617"/>
+      <w:bookmarkStart w:id="140" w:name="_Toc235808079"/>
       <w:r>
         <w:t>Conclusión</w:t>
       </w:r>
-      <w:bookmarkEnd w:id="144"/>
-      <w:bookmarkEnd w:id="145"/>
+      <w:bookmarkEnd w:id="139"/>
+      <w:bookmarkEnd w:id="140"/>
     </w:p>
     <w:p>
       <w:r>
@@ -28774,13 +29241,13 @@
           <w:numId w:val="19"/>
         </w:numPr>
       </w:pPr>
-      <w:bookmarkStart w:id="146" w:name="_Toc233383618"/>
-      <w:bookmarkStart w:id="147" w:name="_Toc235808080"/>
+      <w:bookmarkStart w:id="141" w:name="_Toc233383618"/>
+      <w:bookmarkStart w:id="142" w:name="_Toc235808080"/>
       <w:r>
         <w:t>Limitaciones en la adopción de Inteligencia Artificial en microempresas</w:t>
       </w:r>
-      <w:bookmarkEnd w:id="146"/>
-      <w:bookmarkEnd w:id="147"/>
+      <w:bookmarkEnd w:id="141"/>
+      <w:bookmarkEnd w:id="142"/>
     </w:p>
     <w:p>
       <w:r>
@@ -28892,13 +29359,13 @@
           <w:numId w:val="19"/>
         </w:numPr>
       </w:pPr>
-      <w:bookmarkStart w:id="148" w:name="_Toc233383619"/>
-      <w:bookmarkStart w:id="149" w:name="_Toc235808081"/>
+      <w:bookmarkStart w:id="143" w:name="_Toc233383619"/>
+      <w:bookmarkStart w:id="144" w:name="_Toc235808081"/>
       <w:r>
         <w:t>Asimetrías Tecnológicas y de Conocimiento en el Estrato Microempresarial</w:t>
       </w:r>
-      <w:bookmarkEnd w:id="148"/>
-      <w:bookmarkEnd w:id="149"/>
+      <w:bookmarkEnd w:id="143"/>
+      <w:bookmarkEnd w:id="144"/>
     </w:p>
     <w:p>
       <w:r>
@@ -29021,13 +29488,13 @@
           <w:numId w:val="19"/>
         </w:numPr>
       </w:pPr>
-      <w:bookmarkStart w:id="150" w:name="_Toc233383620"/>
-      <w:bookmarkStart w:id="151" w:name="_Toc235808082"/>
+      <w:bookmarkStart w:id="145" w:name="_Toc233383620"/>
+      <w:bookmarkStart w:id="146" w:name="_Toc235808082"/>
       <w:r>
         <w:t>Barreras de Infraestructura y el Fenómeno de los Silos Informáticos Analógicos</w:t>
       </w:r>
-      <w:bookmarkEnd w:id="150"/>
-      <w:bookmarkEnd w:id="151"/>
+      <w:bookmarkEnd w:id="145"/>
+      <w:bookmarkEnd w:id="146"/>
     </w:p>
     <w:p>
       <w:r>
@@ -29159,8 +29626,8 @@
           <w:numId w:val="19"/>
         </w:numPr>
       </w:pPr>
-      <w:bookmarkStart w:id="152" w:name="_Toc233383621"/>
-      <w:bookmarkStart w:id="153" w:name="_Toc235808083"/>
+      <w:bookmarkStart w:id="147" w:name="_Toc233383621"/>
+      <w:bookmarkStart w:id="148" w:name="_Toc235808083"/>
       <w:r>
         <w:t>Restricciones Presupuestarias y el Costo Total de Propiedad (</w:t>
       </w:r>
@@ -29174,8 +29641,8 @@
       <w:r>
         <w:t>) de la Analítica Avanzada</w:t>
       </w:r>
-      <w:bookmarkEnd w:id="152"/>
-      <w:bookmarkEnd w:id="153"/>
+      <w:bookmarkEnd w:id="147"/>
+      <w:bookmarkEnd w:id="148"/>
     </w:p>
     <w:p>
       <w:r>
@@ -29369,8 +29836,8 @@
           <w:numId w:val="19"/>
         </w:numPr>
       </w:pPr>
-      <w:bookmarkStart w:id="154" w:name="_Toc233383622"/>
-      <w:bookmarkStart w:id="155" w:name="_Toc235808084"/>
+      <w:bookmarkStart w:id="149" w:name="_Toc233383622"/>
+      <w:bookmarkStart w:id="150" w:name="_Toc235808084"/>
       <w:r>
         <w:t>Analfabetismo de Datos (</w:t>
       </w:r>
@@ -29393,8 +29860,8 @@
       <w:r>
         <w:t>) y la Brecha Organizacional de Capital Humano</w:t>
       </w:r>
-      <w:bookmarkEnd w:id="154"/>
-      <w:bookmarkEnd w:id="155"/>
+      <w:bookmarkEnd w:id="149"/>
+      <w:bookmarkEnd w:id="150"/>
     </w:p>
     <w:p>
       <w:r>
@@ -29627,8 +30094,8 @@
           <w:numId w:val="19"/>
         </w:numPr>
       </w:pPr>
-      <w:bookmarkStart w:id="156" w:name="_Toc233383623"/>
-      <w:bookmarkStart w:id="157" w:name="_Toc235808085"/>
+      <w:bookmarkStart w:id="151" w:name="_Toc233383623"/>
+      <w:bookmarkStart w:id="152" w:name="_Toc235808085"/>
       <w:r>
         <w:t xml:space="preserve">La Democratización de la Ciencia de Datos y el Enfoque </w:t>
       </w:r>
@@ -29651,8 +30118,8 @@
       <w:r>
         <w:t xml:space="preserve"> como Vía de Solución</w:t>
       </w:r>
-      <w:bookmarkEnd w:id="156"/>
-      <w:bookmarkEnd w:id="157"/>
+      <w:bookmarkEnd w:id="151"/>
+      <w:bookmarkEnd w:id="152"/>
     </w:p>
     <w:p>
       <w:r>
@@ -29938,13 +30405,13 @@
           <w:numId w:val="19"/>
         </w:numPr>
       </w:pPr>
-      <w:bookmarkStart w:id="158" w:name="_Toc233383624"/>
-      <w:bookmarkStart w:id="159" w:name="_Toc235808086"/>
+      <w:bookmarkStart w:id="153" w:name="_Toc233383624"/>
+      <w:bookmarkStart w:id="154" w:name="_Toc235808086"/>
       <w:r>
         <w:t>Conclusión del Marco Teórico</w:t>
       </w:r>
-      <w:bookmarkEnd w:id="158"/>
-      <w:bookmarkEnd w:id="159"/>
+      <w:bookmarkEnd w:id="153"/>
+      <w:bookmarkEnd w:id="154"/>
     </w:p>
     <w:p>
       <w:r>
@@ -30195,13 +30662,13 @@
         </w:numPr>
       </w:pPr>
       <w:hyperlink w:anchor="bookmark=id.5dgs8ni79cte">
-        <w:bookmarkStart w:id="160" w:name="_Toc233383625"/>
-        <w:bookmarkStart w:id="161" w:name="_Toc235808087"/>
+        <w:bookmarkStart w:id="155" w:name="_Toc233383625"/>
+        <w:bookmarkStart w:id="156" w:name="_Toc235808087"/>
         <w:r>
           <w:t>METODOLOGÍA</w:t>
         </w:r>
-        <w:bookmarkEnd w:id="160"/>
-        <w:bookmarkEnd w:id="161"/>
+        <w:bookmarkEnd w:id="155"/>
+        <w:bookmarkEnd w:id="156"/>
       </w:hyperlink>
     </w:p>
     <w:p>
@@ -30247,13 +30714,13 @@
           <w:numId w:val="19"/>
         </w:numPr>
       </w:pPr>
-      <w:bookmarkStart w:id="162" w:name="_Toc233383626"/>
-      <w:bookmarkStart w:id="163" w:name="_Toc235808088"/>
+      <w:bookmarkStart w:id="157" w:name="_Toc233383626"/>
+      <w:bookmarkStart w:id="158" w:name="_Toc235808088"/>
       <w:r>
         <w:t>Tipo de investigación según el objetivo de ésta</w:t>
       </w:r>
-      <w:bookmarkEnd w:id="162"/>
-      <w:bookmarkEnd w:id="163"/>
+      <w:bookmarkEnd w:id="157"/>
+      <w:bookmarkEnd w:id="158"/>
     </w:p>
     <w:p>
       <w:r>
@@ -30391,13 +30858,13 @@
           <w:numId w:val="19"/>
         </w:numPr>
       </w:pPr>
-      <w:bookmarkStart w:id="164" w:name="_Toc233383627"/>
-      <w:bookmarkStart w:id="165" w:name="_Toc235808089"/>
+      <w:bookmarkStart w:id="159" w:name="_Toc233383627"/>
+      <w:bookmarkStart w:id="160" w:name="_Toc235808089"/>
       <w:r>
         <w:t>Según el nivel de profundización en el objeto de estudio</w:t>
       </w:r>
-      <w:bookmarkEnd w:id="164"/>
-      <w:bookmarkEnd w:id="165"/>
+      <w:bookmarkEnd w:id="159"/>
+      <w:bookmarkEnd w:id="160"/>
     </w:p>
     <w:p>
       <w:r>
@@ -30492,13 +30959,13 @@
           <w:numId w:val="19"/>
         </w:numPr>
       </w:pPr>
-      <w:bookmarkStart w:id="166" w:name="_Toc233383628"/>
-      <w:bookmarkStart w:id="167" w:name="_Toc235808090"/>
+      <w:bookmarkStart w:id="161" w:name="_Toc233383628"/>
+      <w:bookmarkStart w:id="162" w:name="_Toc235808090"/>
       <w:r>
         <w:t>Según el tipo de datos empleados</w:t>
       </w:r>
-      <w:bookmarkEnd w:id="166"/>
-      <w:bookmarkEnd w:id="167"/>
+      <w:bookmarkEnd w:id="161"/>
+      <w:bookmarkEnd w:id="162"/>
     </w:p>
     <w:p>
       <w:r>
@@ -30631,13 +31098,13 @@
           <w:numId w:val="19"/>
         </w:numPr>
       </w:pPr>
-      <w:bookmarkStart w:id="168" w:name="_Toc233383629"/>
-      <w:bookmarkStart w:id="169" w:name="_Toc235808091"/>
+      <w:bookmarkStart w:id="163" w:name="_Toc233383629"/>
+      <w:bookmarkStart w:id="164" w:name="_Toc235808091"/>
       <w:r>
         <w:t>Según el grado de manipulación de las variables</w:t>
       </w:r>
-      <w:bookmarkEnd w:id="168"/>
-      <w:bookmarkEnd w:id="169"/>
+      <w:bookmarkEnd w:id="163"/>
+      <w:bookmarkEnd w:id="164"/>
     </w:p>
     <w:p>
       <w:r>
@@ -30706,14 +31173,14 @@
           <w:numId w:val="19"/>
         </w:numPr>
       </w:pPr>
-      <w:bookmarkStart w:id="170" w:name="_Toc233383630"/>
-      <w:bookmarkStart w:id="171" w:name="_Toc235808092"/>
+      <w:bookmarkStart w:id="165" w:name="_Toc233383630"/>
+      <w:bookmarkStart w:id="166" w:name="_Toc235808092"/>
       <w:r>
         <w:lastRenderedPageBreak/>
         <w:t>Diseño de la Investigación: Experimento con Preprueba, Posprueba y Grupo de Control</w:t>
       </w:r>
-      <w:bookmarkEnd w:id="170"/>
-      <w:bookmarkEnd w:id="171"/>
+      <w:bookmarkEnd w:id="165"/>
+      <w:bookmarkEnd w:id="166"/>
     </w:p>
     <w:p>
       <w:r>
@@ -31043,13 +31510,13 @@
           <w:numId w:val="19"/>
         </w:numPr>
       </w:pPr>
-      <w:bookmarkStart w:id="172" w:name="_Toc233383631"/>
-      <w:bookmarkStart w:id="173" w:name="_Toc235808093"/>
+      <w:bookmarkStart w:id="167" w:name="_Toc233383631"/>
+      <w:bookmarkStart w:id="168" w:name="_Toc235808093"/>
       <w:r>
         <w:t>Según el tipo de inferencia</w:t>
       </w:r>
-      <w:bookmarkEnd w:id="172"/>
-      <w:bookmarkEnd w:id="173"/>
+      <w:bookmarkEnd w:id="167"/>
+      <w:bookmarkEnd w:id="168"/>
     </w:p>
     <w:p>
       <w:r>
@@ -31109,6 +31576,7 @@
         <w:lastRenderedPageBreak/>
         <w:t>En el marco de este estudio, el proceso deductivo parte de los principios generales y abstractos de la Ciencia de Datos, las teorías del Aprendizaje Automático Supervisado y los fundamentos de la Inteligencia de Negocios (</w:t>
       </w:r>
+      <w:proofErr w:type="gramStart"/>
       <w:r>
         <w:rPr>
           <w:i/>
@@ -31125,6 +31593,7 @@
         <w:t>Intelligence</w:t>
       </w:r>
       <w:proofErr w:type="spellEnd"/>
+      <w:proofErr w:type="gramEnd"/>
       <w:r>
         <w:t>). La literatura científica contemporánea postula, de forma generalizada, que la modelación matemática de patrones no lineales mediante algoritmos predictivos supera consistentemente a la heurística humana y a los métodos tradicionales en entornos caracterizados por la volatilidad y la alta incertidumbre.</w:t>
       </w:r>
@@ -31160,13 +31629,13 @@
           <w:numId w:val="19"/>
         </w:numPr>
       </w:pPr>
-      <w:bookmarkStart w:id="174" w:name="_Toc233383632"/>
-      <w:bookmarkStart w:id="175" w:name="_Toc235808094"/>
+      <w:bookmarkStart w:id="169" w:name="_Toc233383632"/>
+      <w:bookmarkStart w:id="170" w:name="_Toc235808094"/>
       <w:r>
         <w:t>Según el periodo temporal en que se realiza</w:t>
       </w:r>
-      <w:bookmarkEnd w:id="174"/>
-      <w:bookmarkEnd w:id="175"/>
+      <w:bookmarkEnd w:id="169"/>
+      <w:bookmarkEnd w:id="170"/>
     </w:p>
     <w:p>
       <w:r>
@@ -31265,13 +31734,13 @@
           <w:numId w:val="19"/>
         </w:numPr>
       </w:pPr>
-      <w:bookmarkStart w:id="176" w:name="_Toc233383633"/>
-      <w:bookmarkStart w:id="177" w:name="_Toc235808095"/>
+      <w:bookmarkStart w:id="171" w:name="_Toc233383633"/>
+      <w:bookmarkStart w:id="172" w:name="_Toc235808095"/>
       <w:r>
         <w:t>Procedimiento Metodológico</w:t>
       </w:r>
-      <w:bookmarkEnd w:id="176"/>
-      <w:bookmarkEnd w:id="177"/>
+      <w:bookmarkEnd w:id="171"/>
+      <w:bookmarkEnd w:id="172"/>
     </w:p>
     <w:p>
       <w:r>
@@ -31286,8 +31755,8 @@
           <w:numId w:val="19"/>
         </w:numPr>
       </w:pPr>
-      <w:bookmarkStart w:id="178" w:name="_Toc233383634"/>
-      <w:bookmarkStart w:id="179" w:name="_Toc235808096"/>
+      <w:bookmarkStart w:id="173" w:name="_Toc233383634"/>
+      <w:bookmarkStart w:id="174" w:name="_Toc235808096"/>
       <w:r>
         <w:t>Recolección y estructuración de los conjuntos de datos (</w:t>
       </w:r>
@@ -31302,8 +31771,8 @@
       <w:r>
         <w:t>)</w:t>
       </w:r>
-      <w:bookmarkEnd w:id="178"/>
-      <w:bookmarkEnd w:id="179"/>
+      <w:bookmarkEnd w:id="173"/>
+      <w:bookmarkEnd w:id="174"/>
     </w:p>
     <w:p>
       <w:r>
@@ -31390,13 +31859,13 @@
           <w:numId w:val="19"/>
         </w:numPr>
       </w:pPr>
-      <w:bookmarkStart w:id="180" w:name="_Toc233383635"/>
-      <w:bookmarkStart w:id="181" w:name="_Toc235808097"/>
+      <w:bookmarkStart w:id="175" w:name="_Toc233383635"/>
+      <w:bookmarkStart w:id="176" w:name="_Toc235808097"/>
       <w:r>
         <w:t>Ingeniería de características y variables exógenas</w:t>
       </w:r>
-      <w:bookmarkEnd w:id="180"/>
-      <w:bookmarkEnd w:id="181"/>
+      <w:bookmarkEnd w:id="175"/>
+      <w:bookmarkEnd w:id="176"/>
     </w:p>
     <w:p>
       <w:r>
@@ -31452,13 +31921,13 @@
           <w:numId w:val="19"/>
         </w:numPr>
       </w:pPr>
-      <w:bookmarkStart w:id="182" w:name="_Toc233383636"/>
-      <w:bookmarkStart w:id="183" w:name="_Toc235808098"/>
+      <w:bookmarkStart w:id="177" w:name="_Toc233383636"/>
+      <w:bookmarkStart w:id="178" w:name="_Toc235808098"/>
       <w:r>
         <w:t>Selección y configuración de modelos predictivos</w:t>
       </w:r>
-      <w:bookmarkEnd w:id="182"/>
-      <w:bookmarkEnd w:id="183"/>
+      <w:bookmarkEnd w:id="177"/>
+      <w:bookmarkEnd w:id="178"/>
     </w:p>
     <w:p>
       <w:r>
@@ -31618,13 +32087,13 @@
           <w:numId w:val="19"/>
         </w:numPr>
       </w:pPr>
-      <w:bookmarkStart w:id="184" w:name="_Toc233383637"/>
-      <w:bookmarkStart w:id="185" w:name="_Toc235808099"/>
+      <w:bookmarkStart w:id="179" w:name="_Toc233383637"/>
+      <w:bookmarkStart w:id="180" w:name="_Toc235808099"/>
       <w:r>
         <w:t>Estrategias de partición temporal y validación</w:t>
       </w:r>
-      <w:bookmarkEnd w:id="184"/>
-      <w:bookmarkEnd w:id="185"/>
+      <w:bookmarkEnd w:id="179"/>
+      <w:bookmarkEnd w:id="180"/>
     </w:p>
     <w:p>
       <w:r>
@@ -31734,13 +32203,13 @@
           <w:numId w:val="19"/>
         </w:numPr>
       </w:pPr>
-      <w:bookmarkStart w:id="186" w:name="_Toc233383638"/>
-      <w:bookmarkStart w:id="187" w:name="_Toc235808100"/>
+      <w:bookmarkStart w:id="181" w:name="_Toc233383638"/>
+      <w:bookmarkStart w:id="182" w:name="_Toc235808100"/>
       <w:r>
         <w:t>Métricas de evaluación del desempeño</w:t>
       </w:r>
-      <w:bookmarkEnd w:id="186"/>
-      <w:bookmarkEnd w:id="187"/>
+      <w:bookmarkEnd w:id="181"/>
+      <w:bookmarkEnd w:id="182"/>
     </w:p>
     <w:p>
       <w:r>
@@ -31848,13 +32317,13 @@
           <w:numId w:val="19"/>
         </w:numPr>
       </w:pPr>
-      <w:bookmarkStart w:id="188" w:name="_Toc233383639"/>
-      <w:bookmarkStart w:id="189" w:name="_Toc235808101"/>
+      <w:bookmarkStart w:id="183" w:name="_Toc233383639"/>
+      <w:bookmarkStart w:id="184" w:name="_Toc235808101"/>
       <w:r>
         <w:t>Integración en Inteligencia de Negocios y simulación financiera</w:t>
       </w:r>
-      <w:bookmarkEnd w:id="188"/>
-      <w:bookmarkEnd w:id="189"/>
+      <w:bookmarkEnd w:id="183"/>
+      <w:bookmarkEnd w:id="184"/>
     </w:p>
     <w:p>
       <w:r>
@@ -31940,13 +32409,13 @@
       <w:r>
         <w:fldChar w:fldCharType="separate"/>
       </w:r>
-      <w:bookmarkStart w:id="190" w:name="_Toc233383640"/>
-      <w:bookmarkStart w:id="191" w:name="_Toc235808102"/>
+      <w:bookmarkStart w:id="185" w:name="_Toc235808102"/>
+      <w:bookmarkStart w:id="186" w:name="_Toc233383640"/>
       <w:r>
         <w:t>DESARROLLO</w:t>
       </w:r>
-      <w:bookmarkEnd w:id="190"/>
-      <w:bookmarkEnd w:id="191"/>
+      <w:bookmarkEnd w:id="185"/>
+      <w:bookmarkEnd w:id="186"/>
     </w:p>
     <w:p>
       <w:pPr>
@@ -31959,8 +32428,8 @@
       <w:r>
         <w:fldChar w:fldCharType="end"/>
       </w:r>
-      <w:bookmarkStart w:id="192" w:name="_Toc233383641"/>
-      <w:bookmarkStart w:id="193" w:name="_Toc235808103"/>
+      <w:bookmarkStart w:id="187" w:name="_Toc233383641"/>
+      <w:bookmarkStart w:id="188" w:name="_Toc235808103"/>
       <w:r>
         <w:t>El repositorio</w:t>
       </w:r>
@@ -31987,6 +32456,9 @@
         <w:keepNext/>
       </w:pPr>
       <w:r>
+        <w:rPr>
+          <w:noProof/>
+        </w:rPr>
         <w:lastRenderedPageBreak/>
         <w:drawing>
           <wp:inline distT="0" distB="0" distL="0" distR="0" wp14:anchorId="1711AABD" wp14:editId="45DFE5EC">
@@ -32060,8 +32532,8 @@
       <w:r>
         <w:t>El contexto del negocio</w:t>
       </w:r>
-      <w:bookmarkEnd w:id="192"/>
-      <w:bookmarkEnd w:id="193"/>
+      <w:bookmarkEnd w:id="187"/>
+      <w:bookmarkEnd w:id="188"/>
     </w:p>
     <w:p>
       <w:pPr>
@@ -32071,8 +32543,8 @@
           <w:numId w:val="19"/>
         </w:numPr>
       </w:pPr>
-      <w:bookmarkStart w:id="194" w:name="_Toc233383642"/>
-      <w:bookmarkStart w:id="195" w:name="_Toc235808104"/>
+      <w:bookmarkStart w:id="189" w:name="_Toc233383642"/>
+      <w:bookmarkStart w:id="190" w:name="_Toc235808104"/>
       <w:r>
         <w:t>El registro de ventas</w:t>
       </w:r>
@@ -32082,8 +32554,8 @@
       <w:r>
         <w:t xml:space="preserve"> compra de insumos</w:t>
       </w:r>
-      <w:bookmarkEnd w:id="194"/>
-      <w:bookmarkEnd w:id="195"/>
+      <w:bookmarkEnd w:id="189"/>
+      <w:bookmarkEnd w:id="190"/>
       <w:r>
         <w:t xml:space="preserve"> </w:t>
       </w:r>
@@ -32137,7 +32609,15 @@
         <w:t>dado que, para generar confianza en el cliente final, al realizar un pedido se le entrega un recibo digital. Para contar con la información unificada, se migró la información del archivo de Excel a la base de datos de la plataforma KYTE.</w:t>
       </w:r>
       <w:r>
-        <w:t xml:space="preserve"> Dicha plataforma permite generar un reporte de ventas diarias el cual se emplea como primer fuente de datos.</w:t>
+        <w:t xml:space="preserve"> Dicha plataforma permite generar un reporte de ventas diarias el cual se emplea como </w:t>
+      </w:r>
+      <w:proofErr w:type="gramStart"/>
+      <w:r>
+        <w:t>primer fuente</w:t>
+      </w:r>
+      <w:proofErr w:type="gramEnd"/>
+      <w:r>
+        <w:t xml:space="preserve"> de datos.</w:t>
       </w:r>
     </w:p>
     <w:p>
@@ -32157,7 +32637,15 @@
         <w:t xml:space="preserve">, con ello, la información se ha ido acumulando al pasar los años. </w:t>
       </w:r>
       <w:r>
-        <w:t>El acceso a la información es directa pues fue un diseño propio.</w:t>
+        <w:t xml:space="preserve">El acceso a la información es </w:t>
+      </w:r>
+      <w:proofErr w:type="gramStart"/>
+      <w:r>
+        <w:t>directa</w:t>
+      </w:r>
+      <w:proofErr w:type="gramEnd"/>
+      <w:r>
+        <w:t xml:space="preserve"> pues fue un diseño propio.</w:t>
       </w:r>
     </w:p>
     <w:p>
@@ -32171,8 +32659,8 @@
         <w:keepNext/>
         <w:jc w:val="center"/>
       </w:pPr>
-      <w:bookmarkStart w:id="196" w:name="_Ref235634813"/>
-      <w:bookmarkStart w:id="197" w:name="_Toc235867484"/>
+      <w:bookmarkStart w:id="191" w:name="_Ref235634813"/>
+      <w:bookmarkStart w:id="192" w:name="_Toc235867484"/>
       <w:r>
         <w:lastRenderedPageBreak/>
         <w:t xml:space="preserve">Tabla </w:t>
@@ -32185,14 +32673,14 @@
           <w:t>2</w:t>
         </w:r>
       </w:fldSimple>
-      <w:bookmarkEnd w:id="196"/>
+      <w:bookmarkEnd w:id="191"/>
       <w:r>
         <w:t xml:space="preserve"> - </w:t>
       </w:r>
       <w:r>
         <w:t>Conjuntos de datos de Ventas y Compras</w:t>
       </w:r>
-      <w:bookmarkEnd w:id="197"/>
+      <w:bookmarkEnd w:id="192"/>
     </w:p>
     <w:tbl>
       <w:tblPr>
@@ -32356,9 +32844,11 @@
             <w:pPr>
               <w:pStyle w:val="TablaTesis"/>
             </w:pPr>
+            <w:proofErr w:type="gramStart"/>
             <w:r>
               <w:t>Status</w:t>
             </w:r>
+            <w:proofErr w:type="gramEnd"/>
           </w:p>
         </w:tc>
         <w:tc>
@@ -33220,10 +33710,12 @@
               <w:pStyle w:val="TablaTesis"/>
             </w:pPr>
             <w:proofErr w:type="spellStart"/>
+            <w:proofErr w:type="gramStart"/>
             <w:r>
               <w:t>Pastel,Galletas</w:t>
             </w:r>
             <w:proofErr w:type="spellEnd"/>
+            <w:proofErr w:type="gramEnd"/>
             <w:r>
               <w:t xml:space="preserve">, </w:t>
             </w:r>
@@ -33446,13 +33938,23 @@
         </w:pBdr>
         <w:spacing w:before="0" w:after="0"/>
       </w:pPr>
+      <w:proofErr w:type="gramStart"/>
       <w:r>
         <w:rPr>
           <w:b/>
           <w:bCs/>
           <w:color w:val="000000"/>
         </w:rPr>
-        <w:t>Status:</w:t>
+        <w:t>Status</w:t>
+      </w:r>
+      <w:proofErr w:type="gramEnd"/>
+      <w:r>
+        <w:rPr>
+          <w:b/>
+          <w:bCs/>
+          <w:color w:val="000000"/>
+        </w:rPr>
+        <w:t>:</w:t>
       </w:r>
       <w:r>
         <w:rPr>
@@ -33967,7 +34469,15 @@
         <w:t>Análisis de Rentabilidad:</w:t>
       </w:r>
       <w:r>
-        <w:t xml:space="preserve"> Evaluación de los márgenes de ganancia por línea de producto o por canal de venta.</w:t>
+        <w:t xml:space="preserve"> Evaluación de los márgenes de ganancia por </w:t>
+      </w:r>
+      <w:proofErr w:type="gramStart"/>
+      <w:r>
+        <w:t>línea</w:t>
+      </w:r>
+      <w:proofErr w:type="gramEnd"/>
+      <w:r>
+        <w:t xml:space="preserve"> de producto o por canal de venta.</w:t>
       </w:r>
     </w:p>
     <w:p>
@@ -34128,12 +34638,21 @@
         </w:numPr>
         <w:spacing w:before="0"/>
       </w:pPr>
-      <w:r>
-        <w:rPr>
-          <w:b/>
-          <w:bCs/>
-        </w:rPr>
-        <w:t>Status:</w:t>
+      <w:proofErr w:type="gramStart"/>
+      <w:r>
+        <w:rPr>
+          <w:b/>
+          <w:bCs/>
+        </w:rPr>
+        <w:t>Status</w:t>
+      </w:r>
+      <w:proofErr w:type="gramEnd"/>
+      <w:r>
+        <w:rPr>
+          <w:b/>
+          <w:bCs/>
+        </w:rPr>
+        <w:t>:</w:t>
       </w:r>
       <w:r>
         <w:t xml:space="preserve"> Clasificador del estado operativo de la transacción (</w:t>
@@ -34523,13 +35042,13 @@
           <w:numId w:val="19"/>
         </w:numPr>
       </w:pPr>
-      <w:bookmarkStart w:id="198" w:name="_Toc233383643"/>
-      <w:bookmarkStart w:id="199" w:name="_Toc235808105"/>
+      <w:bookmarkStart w:id="193" w:name="_Toc233383643"/>
+      <w:bookmarkStart w:id="194" w:name="_Toc235808105"/>
       <w:r>
         <w:t>Conjuntos de datos de variables exógenas temporales y comerciales</w:t>
       </w:r>
-      <w:bookmarkEnd w:id="198"/>
-      <w:bookmarkEnd w:id="199"/>
+      <w:bookmarkEnd w:id="193"/>
+      <w:bookmarkEnd w:id="194"/>
     </w:p>
     <w:p>
       <w:pPr>
@@ -34615,8 +35134,8 @@
         <w:keepNext/>
         <w:jc w:val="center"/>
       </w:pPr>
-      <w:bookmarkStart w:id="200" w:name="_Ref235634993"/>
-      <w:bookmarkStart w:id="201" w:name="_Toc235867485"/>
+      <w:bookmarkStart w:id="195" w:name="_Ref235634993"/>
+      <w:bookmarkStart w:id="196" w:name="_Toc235867485"/>
       <w:r>
         <w:t xml:space="preserve">Tabla </w:t>
       </w:r>
@@ -34628,7 +35147,7 @@
           <w:t>3</w:t>
         </w:r>
       </w:fldSimple>
-      <w:bookmarkEnd w:id="200"/>
+      <w:bookmarkEnd w:id="195"/>
       <w:r>
         <w:t xml:space="preserve"> - </w:t>
       </w:r>
@@ -34643,7 +35162,7 @@
       <w:r>
         <w:t>.)</w:t>
       </w:r>
-      <w:bookmarkEnd w:id="201"/>
+      <w:bookmarkEnd w:id="196"/>
     </w:p>
     <w:tbl>
       <w:tblPr>
@@ -35471,8 +35990,8 @@
         <w:keepNext/>
         <w:jc w:val="center"/>
       </w:pPr>
-      <w:bookmarkStart w:id="202" w:name="_Ref235635131"/>
-      <w:bookmarkStart w:id="203" w:name="_Toc235867486"/>
+      <w:bookmarkStart w:id="197" w:name="_Ref235635131"/>
+      <w:bookmarkStart w:id="198" w:name="_Toc235867486"/>
       <w:r>
         <w:t xml:space="preserve">Tabla </w:t>
       </w:r>
@@ -35484,7 +36003,7 @@
           <w:t>4</w:t>
         </w:r>
       </w:fldSimple>
-      <w:bookmarkEnd w:id="202"/>
+      <w:bookmarkEnd w:id="197"/>
       <w:r>
         <w:t xml:space="preserve"> - Inflación histórica en México (INPC</w:t>
       </w:r>
@@ -35494,7 +36013,7 @@
         </w:rPr>
         <w:t>)</w:t>
       </w:r>
-      <w:bookmarkEnd w:id="203"/>
+      <w:bookmarkEnd w:id="198"/>
     </w:p>
     <w:tbl>
       <w:tblPr>
@@ -36413,8 +36932,8 @@
         <w:keepNext/>
         <w:jc w:val="center"/>
       </w:pPr>
-      <w:bookmarkStart w:id="204" w:name="_Ref235635193"/>
-      <w:bookmarkStart w:id="205" w:name="_Toc235867487"/>
+      <w:bookmarkStart w:id="199" w:name="_Ref235635193"/>
+      <w:bookmarkStart w:id="200" w:name="_Toc235867487"/>
       <w:r>
         <w:t xml:space="preserve">Tabla </w:t>
       </w:r>
@@ -36426,7 +36945,7 @@
           <w:t>5</w:t>
         </w:r>
       </w:fldSimple>
-      <w:bookmarkEnd w:id="204"/>
+      <w:bookmarkEnd w:id="199"/>
       <w:r>
         <w:t xml:space="preserve"> - Temperatura mensual (Tizayuca, </w:t>
       </w:r>
@@ -36438,7 +36957,7 @@
       <w:r>
         <w:t>.)</w:t>
       </w:r>
-      <w:bookmarkEnd w:id="205"/>
+      <w:bookmarkEnd w:id="200"/>
     </w:p>
     <w:tbl>
       <w:tblPr>
@@ -36756,6 +37275,7 @@
     </w:p>
     <w:p>
       <w:r>
+        <w:lastRenderedPageBreak/>
         <w:t xml:space="preserve">El </w:t>
       </w:r>
       <w:r>
@@ -37017,11 +37537,7 @@
         <w:t>Elasticidad de la Demanda según el Clima:</w:t>
       </w:r>
       <w:r>
-        <w:t xml:space="preserve"> El modelo predictivo puede aprender patrones estacionales complejos. Por ejemplo, temperaturas medias elevadas en los meses de primavera/verano suelen correlacionarse con variaciones en el tipo de postres </w:t>
-      </w:r>
-      <w:r>
-        <w:lastRenderedPageBreak/>
-        <w:t>solicitados (preferencia por productos más frescos o caídas en la demanda de repostería densa), permitiendo programar la producción de manera eficiente.</w:t>
+        <w:t xml:space="preserve"> El modelo predictivo puede aprender patrones estacionales complejos. Por ejemplo, temperaturas medias elevadas en los meses de primavera/verano suelen correlacionarse con variaciones en el tipo de postres solicitados (preferencia por productos más frescos o caídas en la demanda de repostería densa), permitiendo programar la producción de manera eficiente.</w:t>
       </w:r>
     </w:p>
     <w:p>
@@ -37060,6 +37576,7 @@
     </w:p>
     <w:p>
       <w:r>
+        <w:lastRenderedPageBreak/>
         <w:t xml:space="preserve">Debido a que el archivo Temperatura_Tizayuca.csv posee una cobertura político-administrativa a nivel nacional, la primera etapa del pipeline de preprocesamiento de datos consistió en un filtrado por máscara booleana sobre la columna Estado, aislando exclusivamente las observaciones correspondientes a 'Hidalgo'. Adicionalmente, dado que la temperatura se presenta con una granularidad mensual y los modelos predictivos operan a nivel diario, se implementó una técnica de interpolación lineal temporal sobre la variable Valor. Esto permitió suavizar la transición térmica entre meses y asignar a cada día del año un valor estimado de temperatura, evitando cambios abruptos artificiales en los límites mensuales del entrenamiento del algoritmo de </w:t>
       </w:r>
       <w:r>
@@ -37090,13 +37607,13 @@
           <w:numId w:val="19"/>
         </w:numPr>
       </w:pPr>
-      <w:bookmarkStart w:id="206" w:name="_Toc233383644"/>
-      <w:bookmarkStart w:id="207" w:name="_Toc235808106"/>
+      <w:bookmarkStart w:id="201" w:name="_Toc233383644"/>
+      <w:bookmarkStart w:id="202" w:name="_Toc235808106"/>
       <w:r>
         <w:t>El proceso de construcción del dataset maestro</w:t>
       </w:r>
-      <w:bookmarkEnd w:id="206"/>
-      <w:bookmarkEnd w:id="207"/>
+      <w:bookmarkEnd w:id="201"/>
+      <w:bookmarkEnd w:id="202"/>
     </w:p>
     <w:p>
       <w:pPr>
@@ -37106,11 +37623,11 @@
           <w:numId w:val="19"/>
         </w:numPr>
       </w:pPr>
-      <w:bookmarkStart w:id="208" w:name="_Toc235808107"/>
+      <w:bookmarkStart w:id="203" w:name="_Toc235808107"/>
       <w:r>
         <w:t>Análisis Exploratorio de Datos (EDA)</w:t>
       </w:r>
-      <w:bookmarkEnd w:id="208"/>
+      <w:bookmarkEnd w:id="203"/>
     </w:p>
     <w:p>
       <w:r>
@@ -37174,7 +37691,7 @@
           <w:bCs/>
         </w:rPr>
       </w:pPr>
-      <w:bookmarkStart w:id="209" w:name="_Toc233383646"/>
+      <w:bookmarkStart w:id="204" w:name="_Toc233383646"/>
       <w:r>
         <w:rPr>
           <w:b/>
@@ -37182,7 +37699,7 @@
         </w:rPr>
         <w:t>Fuentes utilizadas</w:t>
       </w:r>
-      <w:bookmarkEnd w:id="209"/>
+      <w:bookmarkEnd w:id="204"/>
     </w:p>
     <w:p>
       <w:pPr>
@@ -37208,7 +37725,6 @@
         <w:spacing w:before="0" w:after="0"/>
       </w:pPr>
       <w:r>
-        <w:lastRenderedPageBreak/>
         <w:t>Compras.xlsx</w:t>
       </w:r>
     </w:p>
@@ -37283,7 +37799,7 @@
           <w:bCs/>
         </w:rPr>
       </w:pPr>
-      <w:bookmarkStart w:id="210" w:name="_Toc233383647"/>
+      <w:bookmarkStart w:id="205" w:name="_Toc233383647"/>
       <w:r>
         <w:rPr>
           <w:b/>
@@ -37291,13 +37807,14 @@
         </w:rPr>
         <w:t>Criterio general de integración</w:t>
       </w:r>
-      <w:bookmarkEnd w:id="210"/>
+      <w:bookmarkEnd w:id="205"/>
     </w:p>
     <w:p>
       <w:pPr>
         <w:jc w:val="left"/>
       </w:pPr>
       <w:r>
+        <w:lastRenderedPageBreak/>
         <w:t>Se definió como unidad de análisis un registro por día.</w:t>
       </w:r>
       <w:r>
@@ -37387,7 +37904,7 @@
           <w:bCs/>
         </w:rPr>
       </w:pPr>
-      <w:bookmarkStart w:id="211" w:name="_Toc233383648"/>
+      <w:bookmarkStart w:id="206" w:name="_Toc233383648"/>
       <w:r>
         <w:rPr>
           <w:b/>
@@ -37395,7 +37912,7 @@
         </w:rPr>
         <w:t>Reglas de limpieza aplicadas</w:t>
       </w:r>
-      <w:bookmarkEnd w:id="211"/>
+      <w:bookmarkEnd w:id="206"/>
     </w:p>
     <w:p>
       <w:pPr>
@@ -37549,7 +38066,6 @@
           <w:i/>
           <w:iCs/>
         </w:rPr>
-        <w:lastRenderedPageBreak/>
         <w:t>Tratamiento de duplicados</w:t>
       </w:r>
     </w:p>
@@ -37602,6 +38118,7 @@
         <w:spacing w:before="0" w:after="0"/>
       </w:pPr>
       <w:r>
+        <w:lastRenderedPageBreak/>
         <w:t>En variables numéricas agregadas se imputó 0 cuando el día no tenía registros.</w:t>
       </w:r>
     </w:p>
@@ -37726,7 +38243,7 @@
           <w:cols w:space="720"/>
         </w:sectPr>
       </w:pPr>
-      <w:bookmarkStart w:id="212" w:name="_Toc233383649"/>
+      <w:bookmarkStart w:id="207" w:name="_Toc233383649"/>
     </w:p>
     <w:p>
       <w:pPr>
@@ -37743,7 +38260,7 @@
         <w:lastRenderedPageBreak/>
         <w:t>Limpieza por archivo</w:t>
       </w:r>
-      <w:bookmarkEnd w:id="212"/>
+      <w:bookmarkEnd w:id="207"/>
     </w:p>
     <w:p>
       <w:r>
@@ -37803,8 +38320,8 @@
         <w:pStyle w:val="Descripcin"/>
         <w:keepNext/>
       </w:pPr>
-      <w:bookmarkStart w:id="213" w:name="_Ref235864283"/>
-      <w:bookmarkStart w:id="214" w:name="_Toc235867488"/>
+      <w:bookmarkStart w:id="208" w:name="_Ref235864283"/>
+      <w:bookmarkStart w:id="209" w:name="_Toc235867488"/>
       <w:r>
         <w:t xml:space="preserve">Tabla </w:t>
       </w:r>
@@ -37822,8 +38339,8 @@
       <w:r>
         <w:t>Síntesis de fuentes de datos y transformaciones aplicadas</w:t>
       </w:r>
-      <w:bookmarkEnd w:id="213"/>
-      <w:bookmarkEnd w:id="214"/>
+      <w:bookmarkEnd w:id="208"/>
+      <w:bookmarkEnd w:id="209"/>
     </w:p>
     <w:tbl>
       <w:tblPr>
@@ -38475,7 +38992,15 @@
               <w:pStyle w:val="TablaTesis"/>
             </w:pPr>
             <w:r>
-              <w:t>• Homologación de nombres y formatos.• Ajuste de montos y precios unitarios mediante el INPC.</w:t>
+              <w:t xml:space="preserve">• Homologación de nombres y </w:t>
+            </w:r>
+            <w:proofErr w:type="gramStart"/>
+            <w:r>
+              <w:t>formatos.•</w:t>
+            </w:r>
+            <w:proofErr w:type="gramEnd"/>
+            <w:r>
+              <w:t xml:space="preserve"> Ajuste de montos y precios unitarios mediante el INPC.</w:t>
             </w:r>
           </w:p>
           <w:p>
@@ -39102,7 +39627,7 @@
           <w:docGrid w:linePitch="326"/>
         </w:sectPr>
       </w:pPr>
-      <w:bookmarkStart w:id="215" w:name="_Toc233383650"/>
+      <w:bookmarkStart w:id="210" w:name="_Toc233383650"/>
     </w:p>
     <w:p>
       <w:pPr>
@@ -39118,7 +39643,7 @@
       <w:r>
         <w:t xml:space="preserve"> maestro</w:t>
       </w:r>
-      <w:bookmarkEnd w:id="215"/>
+      <w:bookmarkEnd w:id="210"/>
     </w:p>
     <w:p>
       <w:pPr>
@@ -39808,7 +40333,7 @@
       <w:pPr>
         <w:pStyle w:val="Ttulo4"/>
       </w:pPr>
-      <w:bookmarkStart w:id="216" w:name="_Toc233383651"/>
+      <w:bookmarkStart w:id="211" w:name="_Toc233383651"/>
       <w:r>
         <w:t xml:space="preserve">7. Resultados de calidad del </w:t>
       </w:r>
@@ -39818,7 +40343,7 @@
       <w:r>
         <w:t xml:space="preserve"> final</w:t>
       </w:r>
-      <w:bookmarkEnd w:id="216"/>
+      <w:bookmarkEnd w:id="211"/>
     </w:p>
     <w:p>
       <w:pPr>
@@ -39910,11 +40435,11 @@
       <w:pPr>
         <w:pStyle w:val="Ttulo4"/>
       </w:pPr>
-      <w:bookmarkStart w:id="217" w:name="_Toc233383652"/>
+      <w:bookmarkStart w:id="212" w:name="_Toc233383652"/>
       <w:r>
         <w:t>8. Archivos generados</w:t>
       </w:r>
-      <w:bookmarkEnd w:id="217"/>
+      <w:bookmarkEnd w:id="212"/>
     </w:p>
     <w:p>
       <w:pPr>
@@ -40401,7 +40926,7 @@
           <w:numId w:val="19"/>
         </w:numPr>
       </w:pPr>
-      <w:bookmarkStart w:id="218" w:name="_Toc235808108"/>
+      <w:bookmarkStart w:id="213" w:name="_Toc235808108"/>
       <w:r>
         <w:t>Ingeniería de Características (</w:t>
       </w:r>
@@ -40421,7 +40946,7 @@
       <w:r>
         <w:t>)</w:t>
       </w:r>
-      <w:bookmarkEnd w:id="218"/>
+      <w:bookmarkEnd w:id="213"/>
     </w:p>
     <w:p>
       <w:r>
@@ -40491,7 +41016,15 @@
         </w:numPr>
       </w:pPr>
       <w:r>
-        <w:t>`target_ventas_importe_real_2026_05`</w:t>
+        <w:t>`</w:t>
+      </w:r>
+      <w:proofErr w:type="gramStart"/>
+      <w:r>
+        <w:t>target</w:t>
+      </w:r>
+      <w:proofErr w:type="gramEnd"/>
+      <w:r>
+        <w:t>_ventas_importe_real_2026_05`</w:t>
       </w:r>
     </w:p>
     <w:p>
@@ -40503,7 +41036,15 @@
         </w:numPr>
       </w:pPr>
       <w:r>
-        <w:t>`target_compras_total_real_2026_05`</w:t>
+        <w:t>`</w:t>
+      </w:r>
+      <w:proofErr w:type="gramStart"/>
+      <w:r>
+        <w:t>target</w:t>
+      </w:r>
+      <w:proofErr w:type="gramEnd"/>
+      <w:r>
+        <w:t>_compras_total_real_2026_05`</w:t>
       </w:r>
     </w:p>
     <w:p>
@@ -41048,7 +41589,15 @@
         </w:tabs>
       </w:pPr>
       <w:r>
-        <w:t>Se incorporan variables de recencia, como los días transcurridos desde la última venta o la última compra distinta de cero.</w:t>
+        <w:t xml:space="preserve">Se incorporan variables de recencia, como los días transcurridos desde la </w:t>
+      </w:r>
+      <w:proofErr w:type="gramStart"/>
+      <w:r>
+        <w:t>última venta o la última compra</w:t>
+      </w:r>
+      <w:proofErr w:type="gramEnd"/>
+      <w:r>
+        <w:t xml:space="preserve"> distinta de cero.</w:t>
       </w:r>
     </w:p>
     <w:p>
@@ -42181,16 +42730,16 @@
           <w:strike/>
         </w:rPr>
       </w:pPr>
-      <w:bookmarkStart w:id="219" w:name="_Toc233383653"/>
-      <w:bookmarkStart w:id="220" w:name="_Toc235808109"/>
+      <w:bookmarkStart w:id="214" w:name="_Toc233383653"/>
+      <w:bookmarkStart w:id="215" w:name="_Toc235808109"/>
       <w:r>
         <w:rPr>
           <w:strike/>
         </w:rPr>
         <w:t>Diagnóstico de la Línea Base y Evaluación del Método Empírico (Preprueba)</w:t>
       </w:r>
-      <w:bookmarkEnd w:id="219"/>
-      <w:bookmarkEnd w:id="220"/>
+      <w:bookmarkEnd w:id="214"/>
+      <w:bookmarkEnd w:id="215"/>
       <w:r>
         <w:rPr>
           <w:strike/>
@@ -42209,16 +42758,16 @@
           <w:strike/>
         </w:rPr>
       </w:pPr>
-      <w:bookmarkStart w:id="221" w:name="_Toc233383654"/>
-      <w:bookmarkStart w:id="222" w:name="_Toc235808110"/>
+      <w:bookmarkStart w:id="216" w:name="_Toc233383654"/>
+      <w:bookmarkStart w:id="217" w:name="_Toc235808110"/>
       <w:r>
         <w:rPr>
           <w:strike/>
         </w:rPr>
         <w:t>Auditoría, Depuración e Integración del Conjunto de Datos (Dataset)</w:t>
       </w:r>
-      <w:bookmarkEnd w:id="221"/>
-      <w:bookmarkEnd w:id="222"/>
+      <w:bookmarkEnd w:id="216"/>
+      <w:bookmarkEnd w:id="217"/>
       <w:r>
         <w:rPr>
           <w:strike/>
@@ -42237,8 +42786,8 @@
           <w:strike/>
         </w:rPr>
       </w:pPr>
-      <w:bookmarkStart w:id="223" w:name="_Toc233383655"/>
-      <w:bookmarkStart w:id="224" w:name="_Toc235808111"/>
+      <w:bookmarkStart w:id="218" w:name="_Toc233383655"/>
+      <w:bookmarkStart w:id="219" w:name="_Toc235808111"/>
       <w:r>
         <w:rPr>
           <w:strike/>
@@ -42273,8 +42822,8 @@
         </w:rPr>
         <w:t>) y Variables Exógenas</w:t>
       </w:r>
-      <w:bookmarkEnd w:id="223"/>
-      <w:bookmarkEnd w:id="224"/>
+      <w:bookmarkEnd w:id="218"/>
+      <w:bookmarkEnd w:id="219"/>
       <w:r>
         <w:rPr>
           <w:strike/>
@@ -42290,13 +42839,13 @@
           <w:numId w:val="19"/>
         </w:numPr>
       </w:pPr>
-      <w:bookmarkStart w:id="225" w:name="_Toc233383656"/>
-      <w:bookmarkStart w:id="226" w:name="_Toc235808112"/>
+      <w:bookmarkStart w:id="220" w:name="_Toc233383656"/>
+      <w:bookmarkStart w:id="221" w:name="_Toc235808112"/>
       <w:r>
         <w:t>Desarrollo, Configuración y Entrenamiento de los Modelos Predictivos</w:t>
       </w:r>
-      <w:bookmarkEnd w:id="225"/>
-      <w:bookmarkEnd w:id="226"/>
+      <w:bookmarkEnd w:id="220"/>
+      <w:bookmarkEnd w:id="221"/>
       <w:r>
         <w:t xml:space="preserve"> </w:t>
       </w:r>
@@ -42309,13 +42858,13 @@
           <w:numId w:val="19"/>
         </w:numPr>
       </w:pPr>
-      <w:bookmarkStart w:id="227" w:name="_Toc233383657"/>
-      <w:bookmarkStart w:id="228" w:name="_Toc235808113"/>
+      <w:bookmarkStart w:id="222" w:name="_Toc233383657"/>
+      <w:bookmarkStart w:id="223" w:name="_Toc235808113"/>
       <w:r>
         <w:t>Evaluación Comparativa de Rendimiento Analítico (Posprueba vs. Control)</w:t>
       </w:r>
-      <w:bookmarkEnd w:id="227"/>
-      <w:bookmarkEnd w:id="228"/>
+      <w:bookmarkEnd w:id="222"/>
+      <w:bookmarkEnd w:id="223"/>
       <w:r>
         <w:t xml:space="preserve"> </w:t>
       </w:r>
@@ -42328,13 +42877,13 @@
           <w:numId w:val="19"/>
         </w:numPr>
       </w:pPr>
-      <w:bookmarkStart w:id="229" w:name="_Toc233383658"/>
-      <w:bookmarkStart w:id="230" w:name="_Toc235808114"/>
+      <w:bookmarkStart w:id="224" w:name="_Toc233383658"/>
+      <w:bookmarkStart w:id="225" w:name="_Toc235808114"/>
       <w:r>
         <w:t>Arquitectura e Integración del Tablero de Inteligencia de Negocios (DSS)</w:t>
       </w:r>
-      <w:bookmarkEnd w:id="229"/>
-      <w:bookmarkEnd w:id="230"/>
+      <w:bookmarkEnd w:id="224"/>
+      <w:bookmarkEnd w:id="225"/>
       <w:r>
         <w:t xml:space="preserve"> </w:t>
       </w:r>
@@ -42347,13 +42896,13 @@
           <w:numId w:val="19"/>
         </w:numPr>
       </w:pPr>
-      <w:bookmarkStart w:id="231" w:name="_Toc233383659"/>
-      <w:bookmarkStart w:id="232" w:name="_Toc235808115"/>
+      <w:bookmarkStart w:id="226" w:name="_Toc233383659"/>
+      <w:bookmarkStart w:id="227" w:name="_Toc235808115"/>
       <w:r>
         <w:t>Simulación de Escenarios Financieros y de Abastecimiento Operativo</w:t>
       </w:r>
-      <w:bookmarkEnd w:id="231"/>
-      <w:bookmarkEnd w:id="232"/>
+      <w:bookmarkEnd w:id="226"/>
+      <w:bookmarkEnd w:id="227"/>
     </w:p>
     <w:p>
       <w:pPr>
@@ -42668,12 +43217,12 @@
         <w:pStyle w:val="Ttulo2"/>
         <w:ind w:left="0" w:firstLine="0"/>
       </w:pPr>
-      <w:bookmarkStart w:id="233" w:name="_Toc235808116"/>
+      <w:bookmarkStart w:id="228" w:name="_Toc235808116"/>
       <w:r>
         <w:lastRenderedPageBreak/>
         <w:t>GLOSARIO</w:t>
       </w:r>
-      <w:bookmarkEnd w:id="233"/>
+      <w:bookmarkEnd w:id="228"/>
     </w:p>
     <w:p>
       <w:r>
@@ -42729,13 +43278,13 @@
       <w:pPr>
         <w:pStyle w:val="Ttulo2"/>
       </w:pPr>
-      <w:bookmarkStart w:id="234" w:name="_heading=h.rnuzw3thqt5a" w:colFirst="0" w:colLast="0"/>
-      <w:bookmarkStart w:id="235" w:name="_Toc235808117"/>
-      <w:bookmarkEnd w:id="234"/>
+      <w:bookmarkStart w:id="229" w:name="_heading=h.rnuzw3thqt5a" w:colFirst="0" w:colLast="0"/>
+      <w:bookmarkStart w:id="230" w:name="_Toc235808117"/>
+      <w:bookmarkEnd w:id="229"/>
       <w:r>
         <w:t>REFERENCIAS</w:t>
       </w:r>
-      <w:bookmarkEnd w:id="235"/>
+      <w:bookmarkEnd w:id="230"/>
     </w:p>
     <w:p>
       <w:pPr>
@@ -43135,7 +43684,21 @@
         <w:rPr>
           <w:lang w:val="en-US"/>
         </w:rPr>
-        <w:t>Box, G. E. P. (1976). Science and statistics. Journal of the American Statistical Association, 71(356), 791–799. https://doi.org/10.1080/01621459.1976.10480949</w:t>
+        <w:t xml:space="preserve">Box, G. E. P. (1976). Science and </w:t>
+      </w:r>
+      <w:proofErr w:type="gramStart"/>
+      <w:r>
+        <w:rPr>
+          <w:lang w:val="en-US"/>
+        </w:rPr>
+        <w:t>statistics</w:t>
+      </w:r>
+      <w:proofErr w:type="gramEnd"/>
+      <w:r>
+        <w:rPr>
+          <w:lang w:val="en-US"/>
+        </w:rPr>
+        <w:t>. Journal of the American Statistical Association, 71(356), 791–799. https://doi.org/10.1080/01621459.1976.10480949</w:t>
       </w:r>
     </w:p>
     <w:p>
@@ -43180,7 +43743,21 @@
         <w:rPr>
           <w:lang w:val="en-US"/>
         </w:rPr>
-        <w:t xml:space="preserve">Brynjolfsson, E., Hitt, L. M., &amp; Kim, H. H. (2011). Strength in numbers: How does data-driven decision making affect firm performance? </w:t>
+        <w:t xml:space="preserve">Brynjolfsson, E., Hitt, L. M., &amp; Kim, H. H. (2011). Strength in numbers: How does data-driven </w:t>
+      </w:r>
+      <w:proofErr w:type="gramStart"/>
+      <w:r>
+        <w:rPr>
+          <w:lang w:val="en-US"/>
+        </w:rPr>
+        <w:t>decision making</w:t>
+      </w:r>
+      <w:proofErr w:type="gramEnd"/>
+      <w:r>
+        <w:rPr>
+          <w:lang w:val="en-US"/>
+        </w:rPr>
+        <w:t xml:space="preserve"> affect firm performance? </w:t>
       </w:r>
       <w:r>
         <w:rPr>
@@ -43233,7 +43810,21 @@
         <w:rPr>
           <w:lang w:val="en-US"/>
         </w:rPr>
-        <w:t>The effects of ICTs as innovation facilitators for a greater business performance. Evidence from Mexico. Procedia Computer Science, 91, 47–56. https://doi.org/10.1016/j.procs.2016.07.040</w:t>
+        <w:t xml:space="preserve">The effects of ICTs as innovation facilitators for </w:t>
+      </w:r>
+      <w:proofErr w:type="gramStart"/>
+      <w:r>
+        <w:rPr>
+          <w:lang w:val="en-US"/>
+        </w:rPr>
+        <w:t>a greater</w:t>
+      </w:r>
+      <w:proofErr w:type="gramEnd"/>
+      <w:r>
+        <w:rPr>
+          <w:lang w:val="en-US"/>
+        </w:rPr>
+        <w:t xml:space="preserve"> business performance. Evidence from Mexico. Procedia Computer Science, 91, 47–56. https://doi.org/10.1016/j.procs.2016.07.040</w:t>
       </w:r>
     </w:p>
     <w:p>
@@ -43437,7 +44028,21 @@
         <w:rPr>
           <w:lang w:val="en-US"/>
         </w:rPr>
-        <w:t>, H. (2020). Daily retail demand forecasting using machine learning with emphasis on calendric special days. International Journal of Forecasting, 135, 113322. https://doi.org/10.1016/j.ijforecast.2020.02.005.</w:t>
+        <w:t xml:space="preserve">, H. (2020). Daily retail demand </w:t>
+      </w:r>
+      <w:proofErr w:type="gramStart"/>
+      <w:r>
+        <w:rPr>
+          <w:lang w:val="en-US"/>
+        </w:rPr>
+        <w:t>forecasting using</w:t>
+      </w:r>
+      <w:proofErr w:type="gramEnd"/>
+      <w:r>
+        <w:rPr>
+          <w:lang w:val="en-US"/>
+        </w:rPr>
+        <w:t xml:space="preserve"> machine learning with emphasis on calendric special days. International Journal of Forecasting, 135, 113322. https://doi.org/10.1016/j.ijforecast.2020.02.005.</w:t>
       </w:r>
     </w:p>
     <w:p>
@@ -43615,7 +44220,21 @@
         <w:rPr>
           <w:lang w:val="en-US"/>
         </w:rPr>
-        <w:t xml:space="preserve">Kahneman, D., &amp; Tversky, A. (1979). Prospect theory: An analysis of decision under risk. </w:t>
+        <w:t xml:space="preserve">Kahneman, D., &amp; Tversky, A. (1979). Prospect theory: An analysis of </w:t>
+      </w:r>
+      <w:proofErr w:type="gramStart"/>
+      <w:r>
+        <w:rPr>
+          <w:lang w:val="en-US"/>
+        </w:rPr>
+        <w:t>decision</w:t>
+      </w:r>
+      <w:proofErr w:type="gramEnd"/>
+      <w:r>
+        <w:rPr>
+          <w:lang w:val="en-US"/>
+        </w:rPr>
+        <w:t xml:space="preserve"> under risk. </w:t>
       </w:r>
       <w:proofErr w:type="spellStart"/>
       <w:r>
@@ -44212,7 +44831,23 @@
           <w:i/>
           <w:iCs/>
         </w:rPr>
-        <w:t>El método Lean Startup: Cómo crear empresas de éxito utilizando la innovación continua</w:t>
+        <w:t xml:space="preserve">El método Lean </w:t>
+      </w:r>
+      <w:proofErr w:type="gramStart"/>
+      <w:r>
+        <w:rPr>
+          <w:i/>
+          <w:iCs/>
+        </w:rPr>
+        <w:t>Startup</w:t>
+      </w:r>
+      <w:proofErr w:type="gramEnd"/>
+      <w:r>
+        <w:rPr>
+          <w:i/>
+          <w:iCs/>
+        </w:rPr>
+        <w:t>: Cómo crear empresas de éxito utilizando la innovación continua</w:t>
       </w:r>
       <w:r>
         <w:t>. Deusto.</w:t>
@@ -44452,7 +45087,21 @@
         <w:rPr>
           <w:lang w:val="en-US"/>
         </w:rPr>
-        <w:t>Tashman, L. J. (2000). Out-of-sample tests of forecasting accuracy: an analysis and review. International Journal of Forecasting, 16(4), 437-450. https://doi.org/10.1016/S0169-2070(00)00065-0</w:t>
+        <w:t xml:space="preserve">Tashman, L. J. (2000). Out-of-sample tests of forecasting accuracy: </w:t>
+      </w:r>
+      <w:proofErr w:type="gramStart"/>
+      <w:r>
+        <w:rPr>
+          <w:lang w:val="en-US"/>
+        </w:rPr>
+        <w:t>an analysis</w:t>
+      </w:r>
+      <w:proofErr w:type="gramEnd"/>
+      <w:r>
+        <w:rPr>
+          <w:lang w:val="en-US"/>
+        </w:rPr>
+        <w:t xml:space="preserve"> and review. International Journal of Forecasting, 16(4), 437-450. https://doi.org/10.1016/S0169-2070(00)00065-0</w:t>
       </w:r>
     </w:p>
     <w:p>
@@ -53725,6 +54374,25 @@
       <w:sz w:val="18"/>
     </w:rPr>
   </w:style>
+  <w:style w:type="table" w:styleId="Tablaconcuadrcula">
+    <w:name w:val="Table Grid"/>
+    <w:basedOn w:val="Tablanormal"/>
+    <w:uiPriority w:val="39"/>
+    <w:rsid w:val="00C20FF9"/>
+    <w:pPr>
+      <w:spacing w:before="0" w:after="0" w:line="240" w:lineRule="auto"/>
+    </w:pPr>
+    <w:tblPr>
+      <w:tblBorders>
+        <w:top w:val="single" w:sz="4" w:space="0" w:color="auto"/>
+        <w:left w:val="single" w:sz="4" w:space="0" w:color="auto"/>
+        <w:bottom w:val="single" w:sz="4" w:space="0" w:color="auto"/>
+        <w:right w:val="single" w:sz="4" w:space="0" w:color="auto"/>
+        <w:insideH w:val="single" w:sz="4" w:space="0" w:color="auto"/>
+        <w:insideV w:val="single" w:sz="4" w:space="0" w:color="auto"/>
+      </w:tblBorders>
+    </w:tblPr>
+  </w:style>
 </w:styles>
 </file>
 
@@ -54049,28 +54717,28 @@
 </file>
 
 <file path=customXml/item1.xml><?xml version="1.0" encoding="utf-8"?>
+<b:Sources xmlns:b="http://schemas.openxmlformats.org/officeDocument/2006/bibliography" xmlns="http://schemas.openxmlformats.org/officeDocument/2006/bibliography" SelectedStyle="\APASixthEditionOfficeOnline.xsl" StyleName="APA" Version="6"/>
+</file>
+
+<file path=customXml/item2.xml><?xml version="1.0" encoding="utf-8"?>
 <go:gDocsCustomXmlDataStorage xmlns:go="http://customooxmlschemas.google.com/" xmlns:r="http://schemas.openxmlformats.org/officeDocument/2006/relationships" uri="GoogleDocsCustomDataVersion2">
   <go:docsCustomData xmlns:go="http://customooxmlschemas.google.com/" roundtripDataSignature="AMtx7mg9PtG7czpG8toHeIx+KSxZLk8nBQ==">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</go:docsCustomData>
 </go:gDocsCustomXmlDataStorage>
 </file>
 
-<file path=customXml/item2.xml><?xml version="1.0" encoding="utf-8"?>
-<b:Sources xmlns:b="http://schemas.openxmlformats.org/officeDocument/2006/bibliography" xmlns="http://schemas.openxmlformats.org/officeDocument/2006/bibliography" SelectedStyle="\APASixthEditionOfficeOnline.xsl" StyleName="APA" Version="6"/>
+<file path=customXml/itemProps1.xml><?xml version="1.0" encoding="utf-8"?>
+<ds:datastoreItem xmlns:ds="http://schemas.openxmlformats.org/officeDocument/2006/customXml" ds:itemID="{C4343A2C-D79E-4CBA-BB3A-6D9489172B4B}">
+  <ds:schemaRefs>
+    <ds:schemaRef ds:uri="http://schemas.openxmlformats.org/officeDocument/2006/bibliography"/>
+  </ds:schemaRefs>
+</ds:datastoreItem>
 </file>
 
-<file path=customXml/itemProps1.xml><?xml version="1.0" encoding="utf-8"?>
+<file path=customXml/itemProps2.xml><?xml version="1.0" encoding="utf-8"?>
 <ds:datastoreItem xmlns:ds="http://schemas.openxmlformats.org/officeDocument/2006/customXml" ds:itemID="{11111111-1234-1234-1234-123412341234}">
   <ds:schemaRefs>
     <ds:schemaRef ds:uri="http://customooxmlschemas.google.com/"/>
     <ds:schemaRef ds:uri="http://schemas.openxmlformats.org/officeDocument/2006/relationships"/>
   </ds:schemaRefs>
 </ds:datastoreItem>
-</file>
-
-<file path=customXml/itemProps2.xml><?xml version="1.0" encoding="utf-8"?>
-<ds:datastoreItem xmlns:ds="http://schemas.openxmlformats.org/officeDocument/2006/customXml" ds:itemID="{C4343A2C-D79E-4CBA-BB3A-6D9489172B4B}">
-  <ds:schemaRefs>
-    <ds:schemaRef ds:uri="http://schemas.openxmlformats.org/officeDocument/2006/bibliography"/>
-  </ds:schemaRefs>
-</ds:datastoreItem>
 </file>
</xml_diff>